<commit_message>
Audio list: cross out the 5 sounds already in the game
Co-Authored-By: Claude Opus 5.5 <noreply@anthropic.com>
</commit_message>
<xml_diff>
--- a/Fading_Audio_List.docx
+++ b/Fading_Audio_List.docx
@@ -8,6 +8,11 @@
       </w:pPr>
       <w:r>
         <w:t>Fading: the sounds I need</w:t>
+      </w:r>
+    </w:p>
+    <w:p>
+      <w:r>
+        <w:t>Already in the game: 5 of 59 (crossed out below, the green note says which file covers it).</w:t>
       </w:r>
     </w:p>
     <w:p>
@@ -1371,12 +1376,15 @@
         <w:tc>
           <w:tcPr>
             <w:tcW w:type="dxa" w:w="1134"/>
+            <w:shd w:val="clear" w:color="auto" w:fill="EFEFEF"/>
           </w:tcPr>
           <w:p>
             <w:r/>
             <w:r>
               <w:rPr>
                 <w:b/>
+                <w:strike/>
+                <w:color w:val="999999"/>
                 <w:sz w:val="20"/>
               </w:rPr>
               <w:t>audio11</w:t>
@@ -1386,11 +1394,14 @@
         <w:tc>
           <w:tcPr>
             <w:tcW w:type="dxa" w:w="3061"/>
-          </w:tcPr>
-          <w:p>
-            <w:r/>
-            <w:r>
-              <w:rPr>
+            <w:shd w:val="clear" w:color="auto" w:fill="EFEFEF"/>
+          </w:tcPr>
+          <w:p>
+            <w:r/>
+            <w:r>
+              <w:rPr>
+                <w:strike/>
+                <w:color w:val="999999"/>
                 <w:sz w:val="18"/>
               </w:rPr>
               <w:t>Always, quietly, under everything</w:t>
@@ -1400,11 +1411,14 @@
         <w:tc>
           <w:tcPr>
             <w:tcW w:type="dxa" w:w="4649"/>
-          </w:tcPr>
-          <w:p>
-            <w:r/>
-            <w:r>
-              <w:rPr>
+            <w:shd w:val="clear" w:color="auto" w:fill="EFEFEF"/>
+          </w:tcPr>
+          <w:p>
+            <w:r/>
+            <w:r>
+              <w:rPr>
+                <w:strike/>
+                <w:color w:val="999999"/>
                 <w:sz w:val="18"/>
               </w:rPr>
               <w:t>A quiet house at night: faint wind, wood creaks, a far-away clock.</w:t>
@@ -1414,11 +1428,14 @@
         <w:tc>
           <w:tcPr>
             <w:tcW w:type="dxa" w:w="1247"/>
-          </w:tcPr>
-          <w:p>
-            <w:r/>
-            <w:r>
-              <w:rPr>
+            <w:shd w:val="clear" w:color="auto" w:fill="EFEFEF"/>
+          </w:tcPr>
+          <w:p>
+            <w:r/>
+            <w:r>
+              <w:rPr>
+                <w:strike/>
+                <w:color w:val="999999"/>
                 <w:sz w:val="18"/>
               </w:rPr>
               <w:t>20-60 s, loop</w:t>
@@ -1429,11 +1446,14 @@
           <w:tcPr>
             <w:tcW w:type="dxa" w:w="1134"/>
             <w:shd w:val="clear" w:color="auto" w:fill="FFF3CC"/>
-          </w:tcPr>
-          <w:p>
-            <w:r/>
-            <w:r>
-              <w:rPr>
+            <w:shd w:val="clear" w:color="auto" w:fill="EFEFEF"/>
+          </w:tcPr>
+          <w:p>
+            <w:r/>
+            <w:r>
+              <w:rPr>
+                <w:strike/>
+                <w:color w:val="999999"/>
                 <w:sz w:val="18"/>
               </w:rPr>
               <w:t>NICE</w:t>
@@ -1443,11 +1463,13 @@
         <w:tc>
           <w:tcPr>
             <w:tcW w:type="dxa" w:w="2041"/>
-          </w:tcPr>
-          <w:p>
-            <w:r/>
-            <w:r>
-              <w:rPr>
+            <w:shd w:val="clear" w:color="auto" w:fill="EFEFEF"/>
+          </w:tcPr>
+          <w:p>
+            <w:r/>
+            <w:r>
+              <w:rPr>
+                <w:strike/>
                 <w:color w:val="808080"/>
                 <w:sz w:val="18"/>
               </w:rPr>
@@ -1458,13 +1480,17 @@
         <w:tc>
           <w:tcPr>
             <w:tcW w:type="dxa" w:w="1814"/>
-          </w:tcPr>
-          <w:p>
-            <w:r/>
-            <w:r>
-              <w:rPr>
-                <w:sz w:val="18"/>
-              </w:rPr>
+            <w:shd w:val="clear" w:color="auto" w:fill="EFEFEF"/>
+          </w:tcPr>
+          <w:p>
+            <w:r/>
+            <w:r>
+              <w:rPr>
+                <w:b/>
+                <w:color w:val="1E7B34"/>
+                <w:sz w:val="18"/>
+              </w:rPr>
+              <w:t>DONE: Distant cricket ambient sound.mp3 (+ Clock ticking slow.mp3)</w:t>
             </w:r>
           </w:p>
         </w:tc>
@@ -2873,12 +2899,15 @@
         <w:tc>
           <w:tcPr>
             <w:tcW w:type="dxa" w:w="1134"/>
+            <w:shd w:val="clear" w:color="auto" w:fill="EFEFEF"/>
           </w:tcPr>
           <w:p>
             <w:r/>
             <w:r>
               <w:rPr>
                 <w:b/>
+                <w:strike/>
+                <w:color w:val="999999"/>
                 <w:sz w:val="20"/>
               </w:rPr>
               <w:t>audio23</w:t>
@@ -2888,11 +2917,14 @@
         <w:tc>
           <w:tcPr>
             <w:tcW w:type="dxa" w:w="3061"/>
-          </w:tcPr>
-          <w:p>
-            <w:r/>
-            <w:r>
-              <w:rPr>
+            <w:shd w:val="clear" w:color="auto" w:fill="EFEFEF"/>
+          </w:tcPr>
+          <w:p>
+            <w:r/>
+            <w:r>
+              <w:rPr>
+                <w:strike/>
+                <w:color w:val="999999"/>
                 <w:sz w:val="18"/>
               </w:rPr>
               <w:t>Grandma's lamp</w:t>
@@ -2902,11 +2934,14 @@
         <w:tc>
           <w:tcPr>
             <w:tcW w:type="dxa" w:w="4649"/>
-          </w:tcPr>
-          <w:p>
-            <w:r/>
-            <w:r>
-              <w:rPr>
+            <w:shd w:val="clear" w:color="auto" w:fill="EFEFEF"/>
+          </w:tcPr>
+          <w:p>
+            <w:r/>
+            <w:r>
+              <w:rPr>
+                <w:strike/>
+                <w:color w:val="999999"/>
                 <w:sz w:val="18"/>
               </w:rPr>
               <w:t>An old lamp buzzing and flickering.</w:t>
@@ -2916,11 +2951,14 @@
         <w:tc>
           <w:tcPr>
             <w:tcW w:type="dxa" w:w="1247"/>
-          </w:tcPr>
-          <w:p>
-            <w:r/>
-            <w:r>
-              <w:rPr>
+            <w:shd w:val="clear" w:color="auto" w:fill="EFEFEF"/>
+          </w:tcPr>
+          <w:p>
+            <w:r/>
+            <w:r>
+              <w:rPr>
+                <w:strike/>
+                <w:color w:val="999999"/>
                 <w:sz w:val="18"/>
               </w:rPr>
               <w:t>1-2 s</w:t>
@@ -2931,11 +2969,14 @@
           <w:tcPr>
             <w:tcW w:type="dxa" w:w="1134"/>
             <w:shd w:val="clear" w:color="auto" w:fill="FFF3CC"/>
-          </w:tcPr>
-          <w:p>
-            <w:r/>
-            <w:r>
-              <w:rPr>
+            <w:shd w:val="clear" w:color="auto" w:fill="EFEFEF"/>
+          </w:tcPr>
+          <w:p>
+            <w:r/>
+            <w:r>
+              <w:rPr>
+                <w:strike/>
+                <w:color w:val="999999"/>
                 <w:sz w:val="18"/>
               </w:rPr>
               <w:t>NICE</w:t>
@@ -2945,11 +2986,13 @@
         <w:tc>
           <w:tcPr>
             <w:tcW w:type="dxa" w:w="2041"/>
-          </w:tcPr>
-          <w:p>
-            <w:r/>
-            <w:r>
-              <w:rPr>
+            <w:shd w:val="clear" w:color="auto" w:fill="EFEFEF"/>
+          </w:tcPr>
+          <w:p>
+            <w:r/>
+            <w:r>
+              <w:rPr>
+                <w:strike/>
                 <w:color w:val="808080"/>
                 <w:sz w:val="18"/>
               </w:rPr>
@@ -2960,13 +3003,17 @@
         <w:tc>
           <w:tcPr>
             <w:tcW w:type="dxa" w:w="1814"/>
-          </w:tcPr>
-          <w:p>
-            <w:r/>
-            <w:r>
-              <w:rPr>
-                <w:sz w:val="18"/>
-              </w:rPr>
+            <w:shd w:val="clear" w:color="auto" w:fill="EFEFEF"/>
+          </w:tcPr>
+          <w:p>
+            <w:r/>
+            <w:r>
+              <w:rPr>
+                <w:b/>
+                <w:color w:val="1E7B34"/>
+                <w:sz w:val="18"/>
+              </w:rPr>
+              <w:t>DONE: mix_00s (audio-joiner.com).mp3 (lamp switch)</w:t>
             </w:r>
           </w:p>
         </w:tc>
@@ -2975,12 +3022,15 @@
         <w:tc>
           <w:tcPr>
             <w:tcW w:type="dxa" w:w="1134"/>
+            <w:shd w:val="clear" w:color="auto" w:fill="EFEFEF"/>
           </w:tcPr>
           <w:p>
             <w:r/>
             <w:r>
               <w:rPr>
                 <w:b/>
+                <w:strike/>
+                <w:color w:val="999999"/>
                 <w:sz w:val="20"/>
               </w:rPr>
               <w:t>audio24</w:t>
@@ -2990,11 +3040,14 @@
         <w:tc>
           <w:tcPr>
             <w:tcW w:type="dxa" w:w="3061"/>
-          </w:tcPr>
-          <w:p>
-            <w:r/>
-            <w:r>
-              <w:rPr>
+            <w:shd w:val="clear" w:color="auto" w:fill="EFEFEF"/>
+          </w:tcPr>
+          <w:p>
+            <w:r/>
+            <w:r>
+              <w:rPr>
+                <w:strike/>
+                <w:color w:val="999999"/>
                 <w:sz w:val="18"/>
               </w:rPr>
               <w:t>Grandma's photo album</w:t>
@@ -3004,11 +3057,14 @@
         <w:tc>
           <w:tcPr>
             <w:tcW w:type="dxa" w:w="4649"/>
-          </w:tcPr>
-          <w:p>
-            <w:r/>
-            <w:r>
-              <w:rPr>
+            <w:shd w:val="clear" w:color="auto" w:fill="EFEFEF"/>
+          </w:tcPr>
+          <w:p>
+            <w:r/>
+            <w:r>
+              <w:rPr>
+                <w:strike/>
+                <w:color w:val="999999"/>
                 <w:sz w:val="18"/>
               </w:rPr>
               <w:t>A thick page turning.</w:t>
@@ -3018,11 +3074,14 @@
         <w:tc>
           <w:tcPr>
             <w:tcW w:type="dxa" w:w="1247"/>
-          </w:tcPr>
-          <w:p>
-            <w:r/>
-            <w:r>
-              <w:rPr>
+            <w:shd w:val="clear" w:color="auto" w:fill="EFEFEF"/>
+          </w:tcPr>
+          <w:p>
+            <w:r/>
+            <w:r>
+              <w:rPr>
+                <w:strike/>
+                <w:color w:val="999999"/>
                 <w:sz w:val="18"/>
               </w:rPr>
               <w:t>1 s</w:t>
@@ -3033,11 +3092,14 @@
           <w:tcPr>
             <w:tcW w:type="dxa" w:w="1134"/>
             <w:shd w:val="clear" w:color="auto" w:fill="FFF3CC"/>
-          </w:tcPr>
-          <w:p>
-            <w:r/>
-            <w:r>
-              <w:rPr>
+            <w:shd w:val="clear" w:color="auto" w:fill="EFEFEF"/>
+          </w:tcPr>
+          <w:p>
+            <w:r/>
+            <w:r>
+              <w:rPr>
+                <w:strike/>
+                <w:color w:val="999999"/>
                 <w:sz w:val="18"/>
               </w:rPr>
               <w:t>NICE</w:t>
@@ -3047,11 +3109,13 @@
         <w:tc>
           <w:tcPr>
             <w:tcW w:type="dxa" w:w="2041"/>
-          </w:tcPr>
-          <w:p>
-            <w:r/>
-            <w:r>
-              <w:rPr>
+            <w:shd w:val="clear" w:color="auto" w:fill="EFEFEF"/>
+          </w:tcPr>
+          <w:p>
+            <w:r/>
+            <w:r>
+              <w:rPr>
+                <w:strike/>
                 <w:color w:val="808080"/>
                 <w:sz w:val="18"/>
               </w:rPr>
@@ -3062,13 +3126,17 @@
         <w:tc>
           <w:tcPr>
             <w:tcW w:type="dxa" w:w="1814"/>
-          </w:tcPr>
-          <w:p>
-            <w:r/>
-            <w:r>
-              <w:rPr>
-                <w:sz w:val="18"/>
-              </w:rPr>
+            <w:shd w:val="clear" w:color="auto" w:fill="EFEFEF"/>
+          </w:tcPr>
+          <w:p>
+            <w:r/>
+            <w:r>
+              <w:rPr>
+                <w:b/>
+                <w:color w:val="1E7B34"/>
+                <w:sz w:val="18"/>
+              </w:rPr>
+              <w:t>DONE: page-turning_gmWeIwPo.mp3</w:t>
             </w:r>
           </w:p>
         </w:tc>
@@ -3077,12 +3145,15 @@
         <w:tc>
           <w:tcPr>
             <w:tcW w:type="dxa" w:w="1134"/>
+            <w:shd w:val="clear" w:color="auto" w:fill="EFEFEF"/>
           </w:tcPr>
           <w:p>
             <w:r/>
             <w:r>
               <w:rPr>
                 <w:b/>
+                <w:strike/>
+                <w:color w:val="999999"/>
                 <w:sz w:val="20"/>
               </w:rPr>
               <w:t>audio25</w:t>
@@ -3092,11 +3163,14 @@
         <w:tc>
           <w:tcPr>
             <w:tcW w:type="dxa" w:w="3061"/>
-          </w:tcPr>
-          <w:p>
-            <w:r/>
-            <w:r>
-              <w:rPr>
+            <w:shd w:val="clear" w:color="auto" w:fill="EFEFEF"/>
+          </w:tcPr>
+          <w:p>
+            <w:r/>
+            <w:r>
+              <w:rPr>
+                <w:strike/>
+                <w:color w:val="999999"/>
                 <w:sz w:val="18"/>
               </w:rPr>
               <w:t>Grandma's clock</w:t>
@@ -3106,11 +3180,14 @@
         <w:tc>
           <w:tcPr>
             <w:tcW w:type="dxa" w:w="4649"/>
-          </w:tcPr>
-          <w:p>
-            <w:r/>
-            <w:r>
-              <w:rPr>
+            <w:shd w:val="clear" w:color="auto" w:fill="EFEFEF"/>
+          </w:tcPr>
+          <w:p>
+            <w:r/>
+            <w:r>
+              <w:rPr>
+                <w:strike/>
+                <w:color w:val="999999"/>
                 <w:sz w:val="18"/>
               </w:rPr>
               <w:t>An old wall clock chiming once or twice.</w:t>
@@ -3120,11 +3197,14 @@
         <w:tc>
           <w:tcPr>
             <w:tcW w:type="dxa" w:w="1247"/>
-          </w:tcPr>
-          <w:p>
-            <w:r/>
-            <w:r>
-              <w:rPr>
+            <w:shd w:val="clear" w:color="auto" w:fill="EFEFEF"/>
+          </w:tcPr>
+          <w:p>
+            <w:r/>
+            <w:r>
+              <w:rPr>
+                <w:strike/>
+                <w:color w:val="999999"/>
                 <w:sz w:val="18"/>
               </w:rPr>
               <w:t>2-3 s</w:t>
@@ -3135,11 +3215,14 @@
           <w:tcPr>
             <w:tcW w:type="dxa" w:w="1134"/>
             <w:shd w:val="clear" w:color="auto" w:fill="FFF3CC"/>
-          </w:tcPr>
-          <w:p>
-            <w:r/>
-            <w:r>
-              <w:rPr>
+            <w:shd w:val="clear" w:color="auto" w:fill="EFEFEF"/>
+          </w:tcPr>
+          <w:p>
+            <w:r/>
+            <w:r>
+              <w:rPr>
+                <w:strike/>
+                <w:color w:val="999999"/>
                 <w:sz w:val="18"/>
               </w:rPr>
               <w:t>NICE</w:t>
@@ -3149,11 +3232,13 @@
         <w:tc>
           <w:tcPr>
             <w:tcW w:type="dxa" w:w="2041"/>
-          </w:tcPr>
-          <w:p>
-            <w:r/>
-            <w:r>
-              <w:rPr>
+            <w:shd w:val="clear" w:color="auto" w:fill="EFEFEF"/>
+          </w:tcPr>
+          <w:p>
+            <w:r/>
+            <w:r>
+              <w:rPr>
+                <w:strike/>
                 <w:color w:val="808080"/>
                 <w:sz w:val="18"/>
               </w:rPr>
@@ -3164,13 +3249,17 @@
         <w:tc>
           <w:tcPr>
             <w:tcW w:type="dxa" w:w="1814"/>
-          </w:tcPr>
-          <w:p>
-            <w:r/>
-            <w:r>
-              <w:rPr>
-                <w:sz w:val="18"/>
-              </w:rPr>
+            <w:shd w:val="clear" w:color="auto" w:fill="EFEFEF"/>
+          </w:tcPr>
+          <w:p>
+            <w:r/>
+            <w:r>
+              <w:rPr>
+                <w:b/>
+                <w:color w:val="1E7B34"/>
+                <w:sz w:val="18"/>
+              </w:rPr>
+              <w:t>DONE: clock-chiming-1_GVjJ0AWp.mp3</w:t>
             </w:r>
           </w:p>
         </w:tc>
@@ -3179,12 +3268,15 @@
         <w:tc>
           <w:tcPr>
             <w:tcW w:type="dxa" w:w="1134"/>
+            <w:shd w:val="clear" w:color="auto" w:fill="EFEFEF"/>
           </w:tcPr>
           <w:p>
             <w:r/>
             <w:r>
               <w:rPr>
                 <w:b/>
+                <w:strike/>
+                <w:color w:val="999999"/>
                 <w:sz w:val="20"/>
               </w:rPr>
               <w:t>audio26</w:t>
@@ -3194,11 +3286,14 @@
         <w:tc>
           <w:tcPr>
             <w:tcW w:type="dxa" w:w="3061"/>
-          </w:tcPr>
-          <w:p>
-            <w:r/>
-            <w:r>
-              <w:rPr>
+            <w:shd w:val="clear" w:color="auto" w:fill="EFEFEF"/>
+          </w:tcPr>
+          <w:p>
+            <w:r/>
+            <w:r>
+              <w:rPr>
+                <w:strike/>
+                <w:color w:val="999999"/>
                 <w:sz w:val="18"/>
               </w:rPr>
               <w:t>Mom's kitchen radio</w:t>
@@ -3208,11 +3303,14 @@
         <w:tc>
           <w:tcPr>
             <w:tcW w:type="dxa" w:w="4649"/>
-          </w:tcPr>
-          <w:p>
-            <w:r/>
-            <w:r>
-              <w:rPr>
+            <w:shd w:val="clear" w:color="auto" w:fill="EFEFEF"/>
+          </w:tcPr>
+          <w:p>
+            <w:r/>
+            <w:r>
+              <w:rPr>
+                <w:strike/>
+                <w:color w:val="999999"/>
                 <w:sz w:val="18"/>
               </w:rPr>
               <w:t>A short old song from a radio (crackly, warm). It is music.</w:t>
@@ -3222,11 +3320,14 @@
         <w:tc>
           <w:tcPr>
             <w:tcW w:type="dxa" w:w="1247"/>
-          </w:tcPr>
-          <w:p>
-            <w:r/>
-            <w:r>
-              <w:rPr>
+            <w:shd w:val="clear" w:color="auto" w:fill="EFEFEF"/>
+          </w:tcPr>
+          <w:p>
+            <w:r/>
+            <w:r>
+              <w:rPr>
+                <w:strike/>
+                <w:color w:val="999999"/>
                 <w:sz w:val="18"/>
               </w:rPr>
               <w:t>30-60 s</w:t>
@@ -3237,11 +3338,14 @@
           <w:tcPr>
             <w:tcW w:type="dxa" w:w="1134"/>
             <w:shd w:val="clear" w:color="auto" w:fill="FFF3CC"/>
-          </w:tcPr>
-          <w:p>
-            <w:r/>
-            <w:r>
-              <w:rPr>
+            <w:shd w:val="clear" w:color="auto" w:fill="EFEFEF"/>
+          </w:tcPr>
+          <w:p>
+            <w:r/>
+            <w:r>
+              <w:rPr>
+                <w:strike/>
+                <w:color w:val="999999"/>
                 <w:sz w:val="18"/>
               </w:rPr>
               <w:t>NICE</w:t>
@@ -3251,11 +3355,13 @@
         <w:tc>
           <w:tcPr>
             <w:tcW w:type="dxa" w:w="2041"/>
-          </w:tcPr>
-          <w:p>
-            <w:r/>
-            <w:r>
-              <w:rPr>
+            <w:shd w:val="clear" w:color="auto" w:fill="EFEFEF"/>
+          </w:tcPr>
+          <w:p>
+            <w:r/>
+            <w:r>
+              <w:rPr>
+                <w:strike/>
                 <w:color w:val="808080"/>
                 <w:sz w:val="18"/>
               </w:rPr>
@@ -3266,13 +3372,17 @@
         <w:tc>
           <w:tcPr>
             <w:tcW w:type="dxa" w:w="1814"/>
-          </w:tcPr>
-          <w:p>
-            <w:r/>
-            <w:r>
-              <w:rPr>
-                <w:sz w:val="18"/>
-              </w:rPr>
+            <w:shd w:val="clear" w:color="auto" w:fill="EFEFEF"/>
+          </w:tcPr>
+          <w:p>
+            <w:r/>
+            <w:r>
+              <w:rPr>
+                <w:b/>
+                <w:color w:val="1E7B34"/>
+                <w:sz w:val="18"/>
+              </w:rPr>
+              <w:t>DONE: Cant_Help.mp3 + radio tuning / DJ / ad (friend's radio)</w:t>
             </w:r>
           </w:p>
         </w:tc>

</xml_diff>

<commit_message>
Two bars (Mom, Luna) that pick one of four new endings at the end, no abrupt end, crosshair cues, memory lights outside + placeholder playground, six dream cutscenes, audio list for dreams and endings
Co-Authored-By: Claude Opus 5.5 <noreply@anthropic.com>
</commit_message>
<xml_diff>
--- a/Fading_Audio_List.docx
+++ b/Fading_Audio_List.docx
@@ -12,7 +12,7 @@
     </w:p>
     <w:p>
       <w:r>
-        <w:t>Already in the game: 5 of 59 (crossed out below, the green note says which file covers it).</w:t>
+        <w:t>Crossed out = already in the game, or not needed any more (the note says which). Section G is new.</w:t>
       </w:r>
     </w:p>
     <w:p>
@@ -5570,12 +5570,15 @@
         <w:tc>
           <w:tcPr>
             <w:tcW w:type="dxa" w:w="1134"/>
+            <w:shd w:val="clear" w:color="auto" w:fill="EFEFEF"/>
           </w:tcPr>
           <w:p>
             <w:r/>
             <w:r>
               <w:rPr>
                 <w:b/>
+                <w:strike/>
+                <w:color w:val="999999"/>
                 <w:sz w:val="20"/>
               </w:rPr>
               <w:t>audio47</w:t>
@@ -5585,11 +5588,14 @@
         <w:tc>
           <w:tcPr>
             <w:tcW w:type="dxa" w:w="3061"/>
-          </w:tcPr>
-          <w:p>
-            <w:r/>
-            <w:r>
-              <w:rPr>
+            <w:shd w:val="clear" w:color="auto" w:fill="EFEFEF"/>
+          </w:tcPr>
+          <w:p>
+            <w:r/>
+            <w:r>
+              <w:rPr>
+                <w:strike/>
+                <w:color w:val="999999"/>
                 <w:sz w:val="18"/>
               </w:rPr>
               <w:t>Ending 1 (THE LIGHT)</w:t>
@@ -5599,11 +5605,14 @@
         <w:tc>
           <w:tcPr>
             <w:tcW w:type="dxa" w:w="4649"/>
-          </w:tcPr>
-          <w:p>
-            <w:r/>
-            <w:r>
-              <w:rPr>
+            <w:shd w:val="clear" w:color="auto" w:fill="EFEFEF"/>
+          </w:tcPr>
+          <w:p>
+            <w:r/>
+            <w:r>
+              <w:rPr>
+                <w:strike/>
+                <w:color w:val="999999"/>
                 <w:sz w:val="18"/>
               </w:rPr>
               <w:t>Mom, calm, eyes wet: "It's okay. We're going to be okay."</w:t>
@@ -5613,11 +5622,14 @@
         <w:tc>
           <w:tcPr>
             <w:tcW w:type="dxa" w:w="1247"/>
-          </w:tcPr>
-          <w:p>
-            <w:r/>
-            <w:r>
-              <w:rPr>
+            <w:shd w:val="clear" w:color="auto" w:fill="EFEFEF"/>
+          </w:tcPr>
+          <w:p>
+            <w:r/>
+            <w:r>
+              <w:rPr>
+                <w:strike/>
+                <w:color w:val="999999"/>
                 <w:sz w:val="18"/>
               </w:rPr>
               <w:t>4 s</w:t>
@@ -5628,11 +5640,14 @@
           <w:tcPr>
             <w:tcW w:type="dxa" w:w="1134"/>
             <w:shd w:val="clear" w:color="auto" w:fill="E6EEF8"/>
-          </w:tcPr>
-          <w:p>
-            <w:r/>
-            <w:r>
-              <w:rPr>
+            <w:shd w:val="clear" w:color="auto" w:fill="EFEFEF"/>
+          </w:tcPr>
+          <w:p>
+            <w:r/>
+            <w:r>
+              <w:rPr>
+                <w:strike/>
+                <w:color w:val="999999"/>
                 <w:sz w:val="18"/>
               </w:rPr>
               <w:t>OPTIONAL</w:t>
@@ -5642,11 +5657,13 @@
         <w:tc>
           <w:tcPr>
             <w:tcW w:type="dxa" w:w="2041"/>
-          </w:tcPr>
-          <w:p>
-            <w:r/>
-            <w:r>
-              <w:rPr>
+            <w:shd w:val="clear" w:color="auto" w:fill="EFEFEF"/>
+          </w:tcPr>
+          <w:p>
+            <w:r/>
+            <w:r>
+              <w:rPr>
+                <w:strike/>
                 <w:color w:val="808080"/>
                 <w:sz w:val="18"/>
               </w:rPr>
@@ -5657,13 +5674,17 @@
         <w:tc>
           <w:tcPr>
             <w:tcW w:type="dxa" w:w="1814"/>
-          </w:tcPr>
-          <w:p>
-            <w:r/>
-            <w:r>
-              <w:rPr>
-                <w:sz w:val="18"/>
-              </w:rPr>
+            <w:shd w:val="clear" w:color="auto" w:fill="EFEFEF"/>
+          </w:tcPr>
+          <w:p>
+            <w:r/>
+            <w:r>
+              <w:rPr>
+                <w:b/>
+                <w:color w:val="1E7B34"/>
+                <w:sz w:val="18"/>
+              </w:rPr>
+              <w:t>NOT NEEDED ANY MORE (the endings changed)</w:t>
             </w:r>
           </w:p>
         </w:tc>
@@ -5672,12 +5693,15 @@
         <w:tc>
           <w:tcPr>
             <w:tcW w:type="dxa" w:w="1134"/>
+            <w:shd w:val="clear" w:color="auto" w:fill="EFEFEF"/>
           </w:tcPr>
           <w:p>
             <w:r/>
             <w:r>
               <w:rPr>
                 <w:b/>
+                <w:strike/>
+                <w:color w:val="999999"/>
                 <w:sz w:val="20"/>
               </w:rPr>
               <w:t>audio48</w:t>
@@ -5687,11 +5711,14 @@
         <w:tc>
           <w:tcPr>
             <w:tcW w:type="dxa" w:w="3061"/>
-          </w:tcPr>
-          <w:p>
-            <w:r/>
-            <w:r>
-              <w:rPr>
+            <w:shd w:val="clear" w:color="auto" w:fill="EFEFEF"/>
+          </w:tcPr>
+          <w:p>
+            <w:r/>
+            <w:r>
+              <w:rPr>
+                <w:strike/>
+                <w:color w:val="999999"/>
                 <w:sz w:val="18"/>
               </w:rPr>
               <w:t>Ending 1 (THE LIGHT)</w:t>
@@ -5701,11 +5728,14 @@
         <w:tc>
           <w:tcPr>
             <w:tcW w:type="dxa" w:w="4649"/>
-          </w:tcPr>
-          <w:p>
-            <w:r/>
-            <w:r>
-              <w:rPr>
+            <w:shd w:val="clear" w:color="auto" w:fill="EFEFEF"/>
+          </w:tcPr>
+          <w:p>
+            <w:r/>
+            <w:r>
+              <w:rPr>
+                <w:strike/>
+                <w:color w:val="999999"/>
                 <w:sz w:val="18"/>
               </w:rPr>
               <w:t>Mom, letting go: "You can go now."</w:t>
@@ -5715,11 +5745,14 @@
         <w:tc>
           <w:tcPr>
             <w:tcW w:type="dxa" w:w="1247"/>
-          </w:tcPr>
-          <w:p>
-            <w:r/>
-            <w:r>
-              <w:rPr>
+            <w:shd w:val="clear" w:color="auto" w:fill="EFEFEF"/>
+          </w:tcPr>
+          <w:p>
+            <w:r/>
+            <w:r>
+              <w:rPr>
+                <w:strike/>
+                <w:color w:val="999999"/>
                 <w:sz w:val="18"/>
               </w:rPr>
               <w:t>3 s</w:t>
@@ -5730,11 +5763,14 @@
           <w:tcPr>
             <w:tcW w:type="dxa" w:w="1134"/>
             <w:shd w:val="clear" w:color="auto" w:fill="E6EEF8"/>
-          </w:tcPr>
-          <w:p>
-            <w:r/>
-            <w:r>
-              <w:rPr>
+            <w:shd w:val="clear" w:color="auto" w:fill="EFEFEF"/>
+          </w:tcPr>
+          <w:p>
+            <w:r/>
+            <w:r>
+              <w:rPr>
+                <w:strike/>
+                <w:color w:val="999999"/>
                 <w:sz w:val="18"/>
               </w:rPr>
               <w:t>OPTIONAL</w:t>
@@ -5744,11 +5780,13 @@
         <w:tc>
           <w:tcPr>
             <w:tcW w:type="dxa" w:w="2041"/>
-          </w:tcPr>
-          <w:p>
-            <w:r/>
-            <w:r>
-              <w:rPr>
+            <w:shd w:val="clear" w:color="auto" w:fill="EFEFEF"/>
+          </w:tcPr>
+          <w:p>
+            <w:r/>
+            <w:r>
+              <w:rPr>
+                <w:strike/>
                 <w:color w:val="808080"/>
                 <w:sz w:val="18"/>
               </w:rPr>
@@ -5759,13 +5797,17 @@
         <w:tc>
           <w:tcPr>
             <w:tcW w:type="dxa" w:w="1814"/>
-          </w:tcPr>
-          <w:p>
-            <w:r/>
-            <w:r>
-              <w:rPr>
-                <w:sz w:val="18"/>
-              </w:rPr>
+            <w:shd w:val="clear" w:color="auto" w:fill="EFEFEF"/>
+          </w:tcPr>
+          <w:p>
+            <w:r/>
+            <w:r>
+              <w:rPr>
+                <w:b/>
+                <w:color w:val="1E7B34"/>
+                <w:sz w:val="18"/>
+              </w:rPr>
+              <w:t>NOT NEEDED ANY MORE (the endings changed)</w:t>
             </w:r>
           </w:p>
         </w:tc>
@@ -5774,12 +5816,15 @@
         <w:tc>
           <w:tcPr>
             <w:tcW w:type="dxa" w:w="1134"/>
+            <w:shd w:val="clear" w:color="auto" w:fill="EFEFEF"/>
           </w:tcPr>
           <w:p>
             <w:r/>
             <w:r>
               <w:rPr>
                 <w:b/>
+                <w:strike/>
+                <w:color w:val="999999"/>
                 <w:sz w:val="20"/>
               </w:rPr>
               <w:t>audio49</w:t>
@@ -5789,11 +5834,14 @@
         <w:tc>
           <w:tcPr>
             <w:tcW w:type="dxa" w:w="3061"/>
-          </w:tcPr>
-          <w:p>
-            <w:r/>
-            <w:r>
-              <w:rPr>
+            <w:shd w:val="clear" w:color="auto" w:fill="EFEFEF"/>
+          </w:tcPr>
+          <w:p>
+            <w:r/>
+            <w:r>
+              <w:rPr>
+                <w:strike/>
+                <w:color w:val="999999"/>
                 <w:sz w:val="18"/>
               </w:rPr>
               <w:t>Ending 2 (THE ECHO)</w:t>
@@ -5803,11 +5851,14 @@
         <w:tc>
           <w:tcPr>
             <w:tcW w:type="dxa" w:w="4649"/>
-          </w:tcPr>
-          <w:p>
-            <w:r/>
-            <w:r>
-              <w:rPr>
+            <w:shd w:val="clear" w:color="auto" w:fill="EFEFEF"/>
+          </w:tcPr>
+          <w:p>
+            <w:r/>
+            <w:r>
+              <w:rPr>
+                <w:strike/>
+                <w:color w:val="999999"/>
                 <w:sz w:val="18"/>
               </w:rPr>
               <w:t>Mom, unsure: "Sometimes I feel you here. I don't know why."</w:t>
@@ -5817,11 +5868,14 @@
         <w:tc>
           <w:tcPr>
             <w:tcW w:type="dxa" w:w="1247"/>
-          </w:tcPr>
-          <w:p>
-            <w:r/>
-            <w:r>
-              <w:rPr>
+            <w:shd w:val="clear" w:color="auto" w:fill="EFEFEF"/>
+          </w:tcPr>
+          <w:p>
+            <w:r/>
+            <w:r>
+              <w:rPr>
+                <w:strike/>
+                <w:color w:val="999999"/>
                 <w:sz w:val="18"/>
               </w:rPr>
               <w:t>4 s</w:t>
@@ -5832,11 +5886,14 @@
           <w:tcPr>
             <w:tcW w:type="dxa" w:w="1134"/>
             <w:shd w:val="clear" w:color="auto" w:fill="E6EEF8"/>
-          </w:tcPr>
-          <w:p>
-            <w:r/>
-            <w:r>
-              <w:rPr>
+            <w:shd w:val="clear" w:color="auto" w:fill="EFEFEF"/>
+          </w:tcPr>
+          <w:p>
+            <w:r/>
+            <w:r>
+              <w:rPr>
+                <w:strike/>
+                <w:color w:val="999999"/>
                 <w:sz w:val="18"/>
               </w:rPr>
               <w:t>OPTIONAL</w:t>
@@ -5846,11 +5903,13 @@
         <w:tc>
           <w:tcPr>
             <w:tcW w:type="dxa" w:w="2041"/>
-          </w:tcPr>
-          <w:p>
-            <w:r/>
-            <w:r>
-              <w:rPr>
+            <w:shd w:val="clear" w:color="auto" w:fill="EFEFEF"/>
+          </w:tcPr>
+          <w:p>
+            <w:r/>
+            <w:r>
+              <w:rPr>
+                <w:strike/>
                 <w:color w:val="808080"/>
                 <w:sz w:val="18"/>
               </w:rPr>
@@ -5861,13 +5920,17 @@
         <w:tc>
           <w:tcPr>
             <w:tcW w:type="dxa" w:w="1814"/>
-          </w:tcPr>
-          <w:p>
-            <w:r/>
-            <w:r>
-              <w:rPr>
-                <w:sz w:val="18"/>
-              </w:rPr>
+            <w:shd w:val="clear" w:color="auto" w:fill="EFEFEF"/>
+          </w:tcPr>
+          <w:p>
+            <w:r/>
+            <w:r>
+              <w:rPr>
+                <w:b/>
+                <w:color w:val="1E7B34"/>
+                <w:sz w:val="18"/>
+              </w:rPr>
+              <w:t>NOT NEEDED ANY MORE (the endings changed)</w:t>
             </w:r>
           </w:p>
         </w:tc>
@@ -5876,12 +5939,15 @@
         <w:tc>
           <w:tcPr>
             <w:tcW w:type="dxa" w:w="1134"/>
+            <w:shd w:val="clear" w:color="auto" w:fill="EFEFEF"/>
           </w:tcPr>
           <w:p>
             <w:r/>
             <w:r>
               <w:rPr>
                 <w:b/>
+                <w:strike/>
+                <w:color w:val="999999"/>
                 <w:sz w:val="20"/>
               </w:rPr>
               <w:t>audio50</w:t>
@@ -5891,11 +5957,14 @@
         <w:tc>
           <w:tcPr>
             <w:tcW w:type="dxa" w:w="3061"/>
-          </w:tcPr>
-          <w:p>
-            <w:r/>
-            <w:r>
-              <w:rPr>
+            <w:shd w:val="clear" w:color="auto" w:fill="EFEFEF"/>
+          </w:tcPr>
+          <w:p>
+            <w:r/>
+            <w:r>
+              <w:rPr>
+                <w:strike/>
+                <w:color w:val="999999"/>
                 <w:sz w:val="18"/>
               </w:rPr>
               <w:t>Ending 2 (THE ECHO)</w:t>
@@ -5905,11 +5974,14 @@
         <w:tc>
           <w:tcPr>
             <w:tcW w:type="dxa" w:w="4649"/>
-          </w:tcPr>
-          <w:p>
-            <w:r/>
-            <w:r>
-              <w:rPr>
+            <w:shd w:val="clear" w:color="auto" w:fill="EFEFEF"/>
+          </w:tcPr>
+          <w:p>
+            <w:r/>
+            <w:r>
+              <w:rPr>
+                <w:strike/>
+                <w:color w:val="999999"/>
                 <w:sz w:val="18"/>
               </w:rPr>
               <w:t>Mom, quiet: "Goodbye, anyway."</w:t>
@@ -5919,11 +5991,14 @@
         <w:tc>
           <w:tcPr>
             <w:tcW w:type="dxa" w:w="1247"/>
-          </w:tcPr>
-          <w:p>
-            <w:r/>
-            <w:r>
-              <w:rPr>
+            <w:shd w:val="clear" w:color="auto" w:fill="EFEFEF"/>
+          </w:tcPr>
+          <w:p>
+            <w:r/>
+            <w:r>
+              <w:rPr>
+                <w:strike/>
+                <w:color w:val="999999"/>
                 <w:sz w:val="18"/>
               </w:rPr>
               <w:t>2 s</w:t>
@@ -5934,11 +6009,14 @@
           <w:tcPr>
             <w:tcW w:type="dxa" w:w="1134"/>
             <w:shd w:val="clear" w:color="auto" w:fill="E6EEF8"/>
-          </w:tcPr>
-          <w:p>
-            <w:r/>
-            <w:r>
-              <w:rPr>
+            <w:shd w:val="clear" w:color="auto" w:fill="EFEFEF"/>
+          </w:tcPr>
+          <w:p>
+            <w:r/>
+            <w:r>
+              <w:rPr>
+                <w:strike/>
+                <w:color w:val="999999"/>
                 <w:sz w:val="18"/>
               </w:rPr>
               <w:t>OPTIONAL</w:t>
@@ -5948,11 +6026,13 @@
         <w:tc>
           <w:tcPr>
             <w:tcW w:type="dxa" w:w="2041"/>
-          </w:tcPr>
-          <w:p>
-            <w:r/>
-            <w:r>
-              <w:rPr>
+            <w:shd w:val="clear" w:color="auto" w:fill="EFEFEF"/>
+          </w:tcPr>
+          <w:p>
+            <w:r/>
+            <w:r>
+              <w:rPr>
+                <w:strike/>
                 <w:color w:val="808080"/>
                 <w:sz w:val="18"/>
               </w:rPr>
@@ -5963,13 +6043,17 @@
         <w:tc>
           <w:tcPr>
             <w:tcW w:type="dxa" w:w="1814"/>
-          </w:tcPr>
-          <w:p>
-            <w:r/>
-            <w:r>
-              <w:rPr>
-                <w:sz w:val="18"/>
-              </w:rPr>
+            <w:shd w:val="clear" w:color="auto" w:fill="EFEFEF"/>
+          </w:tcPr>
+          <w:p>
+            <w:r/>
+            <w:r>
+              <w:rPr>
+                <w:b/>
+                <w:color w:val="1E7B34"/>
+                <w:sz w:val="18"/>
+              </w:rPr>
+              <w:t>NOT NEEDED ANY MORE (the endings changed)</w:t>
             </w:r>
           </w:p>
         </w:tc>
@@ -5978,12 +6062,15 @@
         <w:tc>
           <w:tcPr>
             <w:tcW w:type="dxa" w:w="1134"/>
+            <w:shd w:val="clear" w:color="auto" w:fill="EFEFEF"/>
           </w:tcPr>
           <w:p>
             <w:r/>
             <w:r>
               <w:rPr>
                 <w:b/>
+                <w:strike/>
+                <w:color w:val="999999"/>
                 <w:sz w:val="20"/>
               </w:rPr>
               <w:t>audio51</w:t>
@@ -5993,11 +6080,14 @@
         <w:tc>
           <w:tcPr>
             <w:tcW w:type="dxa" w:w="3061"/>
-          </w:tcPr>
-          <w:p>
-            <w:r/>
-            <w:r>
-              <w:rPr>
+            <w:shd w:val="clear" w:color="auto" w:fill="EFEFEF"/>
+          </w:tcPr>
+          <w:p>
+            <w:r/>
+            <w:r>
+              <w:rPr>
+                <w:strike/>
+                <w:color w:val="999999"/>
                 <w:sz w:val="18"/>
               </w:rPr>
               <w:t>Ending 3 (THE COLD)</w:t>
@@ -6007,11 +6097,14 @@
         <w:tc>
           <w:tcPr>
             <w:tcW w:type="dxa" w:w="4649"/>
-          </w:tcPr>
-          <w:p>
-            <w:r/>
-            <w:r>
-              <w:rPr>
+            <w:shd w:val="clear" w:color="auto" w:fill="EFEFEF"/>
+          </w:tcPr>
+          <w:p>
+            <w:r/>
+            <w:r>
+              <w:rPr>
+                <w:strike/>
+                <w:color w:val="999999"/>
                 <w:sz w:val="18"/>
               </w:rPr>
               <w:t>Mom, tired, to the baby: "This house is so cold now. Come on, Luna. Let's go."</w:t>
@@ -6021,11 +6114,14 @@
         <w:tc>
           <w:tcPr>
             <w:tcW w:type="dxa" w:w="1247"/>
-          </w:tcPr>
-          <w:p>
-            <w:r/>
-            <w:r>
-              <w:rPr>
+            <w:shd w:val="clear" w:color="auto" w:fill="EFEFEF"/>
+          </w:tcPr>
+          <w:p>
+            <w:r/>
+            <w:r>
+              <w:rPr>
+                <w:strike/>
+                <w:color w:val="999999"/>
                 <w:sz w:val="18"/>
               </w:rPr>
               <w:t>5 s</w:t>
@@ -6036,11 +6132,14 @@
           <w:tcPr>
             <w:tcW w:type="dxa" w:w="1134"/>
             <w:shd w:val="clear" w:color="auto" w:fill="E6EEF8"/>
-          </w:tcPr>
-          <w:p>
-            <w:r/>
-            <w:r>
-              <w:rPr>
+            <w:shd w:val="clear" w:color="auto" w:fill="EFEFEF"/>
+          </w:tcPr>
+          <w:p>
+            <w:r/>
+            <w:r>
+              <w:rPr>
+                <w:strike/>
+                <w:color w:val="999999"/>
                 <w:sz w:val="18"/>
               </w:rPr>
               <w:t>OPTIONAL</w:t>
@@ -6050,11 +6149,13 @@
         <w:tc>
           <w:tcPr>
             <w:tcW w:type="dxa" w:w="2041"/>
-          </w:tcPr>
-          <w:p>
-            <w:r/>
-            <w:r>
-              <w:rPr>
+            <w:shd w:val="clear" w:color="auto" w:fill="EFEFEF"/>
+          </w:tcPr>
+          <w:p>
+            <w:r/>
+            <w:r>
+              <w:rPr>
+                <w:strike/>
                 <w:color w:val="808080"/>
                 <w:sz w:val="18"/>
               </w:rPr>
@@ -6065,13 +6166,17 @@
         <w:tc>
           <w:tcPr>
             <w:tcW w:type="dxa" w:w="1814"/>
-          </w:tcPr>
-          <w:p>
-            <w:r/>
-            <w:r>
-              <w:rPr>
-                <w:sz w:val="18"/>
-              </w:rPr>
+            <w:shd w:val="clear" w:color="auto" w:fill="EFEFEF"/>
+          </w:tcPr>
+          <w:p>
+            <w:r/>
+            <w:r>
+              <w:rPr>
+                <w:b/>
+                <w:color w:val="1E7B34"/>
+                <w:sz w:val="18"/>
+              </w:rPr>
+              <w:t>NOT NEEDED ANY MORE (the endings changed)</w:t>
             </w:r>
           </w:p>
         </w:tc>
@@ -6080,12 +6185,15 @@
         <w:tc>
           <w:tcPr>
             <w:tcW w:type="dxa" w:w="1134"/>
+            <w:shd w:val="clear" w:color="auto" w:fill="EFEFEF"/>
           </w:tcPr>
           <w:p>
             <w:r/>
             <w:r>
               <w:rPr>
                 <w:b/>
+                <w:strike/>
+                <w:color w:val="999999"/>
                 <w:sz w:val="20"/>
               </w:rPr>
               <w:t>audio52</w:t>
@@ -6095,11 +6203,14 @@
         <w:tc>
           <w:tcPr>
             <w:tcW w:type="dxa" w:w="3061"/>
-          </w:tcPr>
-          <w:p>
-            <w:r/>
-            <w:r>
-              <w:rPr>
+            <w:shd w:val="clear" w:color="auto" w:fill="EFEFEF"/>
+          </w:tcPr>
+          <w:p>
+            <w:r/>
+            <w:r>
+              <w:rPr>
+                <w:strike/>
+                <w:color w:val="999999"/>
                 <w:sz w:val="18"/>
               </w:rPr>
               <w:t>Ending 4 (THE FADING)</w:t>
@@ -6109,11 +6220,14 @@
         <w:tc>
           <w:tcPr>
             <w:tcW w:type="dxa" w:w="4649"/>
-          </w:tcPr>
-          <w:p>
-            <w:r/>
-            <w:r>
-              <w:rPr>
+            <w:shd w:val="clear" w:color="auto" w:fill="EFEFEF"/>
+          </w:tcPr>
+          <w:p>
+            <w:r/>
+            <w:r>
+              <w:rPr>
+                <w:strike/>
+                <w:color w:val="999999"/>
                 <w:sz w:val="18"/>
               </w:rPr>
               <w:t>The ghost, empty: "Nobody noticed. Nobody turned around."</w:t>
@@ -6123,11 +6237,14 @@
         <w:tc>
           <w:tcPr>
             <w:tcW w:type="dxa" w:w="1247"/>
-          </w:tcPr>
-          <w:p>
-            <w:r/>
-            <w:r>
-              <w:rPr>
+            <w:shd w:val="clear" w:color="auto" w:fill="EFEFEF"/>
+          </w:tcPr>
+          <w:p>
+            <w:r/>
+            <w:r>
+              <w:rPr>
+                <w:strike/>
+                <w:color w:val="999999"/>
                 <w:sz w:val="18"/>
               </w:rPr>
               <w:t>4 s</w:t>
@@ -6138,11 +6255,14 @@
           <w:tcPr>
             <w:tcW w:type="dxa" w:w="1134"/>
             <w:shd w:val="clear" w:color="auto" w:fill="E6EEF8"/>
-          </w:tcPr>
-          <w:p>
-            <w:r/>
-            <w:r>
-              <w:rPr>
+            <w:shd w:val="clear" w:color="auto" w:fill="EFEFEF"/>
+          </w:tcPr>
+          <w:p>
+            <w:r/>
+            <w:r>
+              <w:rPr>
+                <w:strike/>
+                <w:color w:val="999999"/>
                 <w:sz w:val="18"/>
               </w:rPr>
               <w:t>OPTIONAL</w:t>
@@ -6152,11 +6272,13 @@
         <w:tc>
           <w:tcPr>
             <w:tcW w:type="dxa" w:w="2041"/>
-          </w:tcPr>
-          <w:p>
-            <w:r/>
-            <w:r>
-              <w:rPr>
+            <w:shd w:val="clear" w:color="auto" w:fill="EFEFEF"/>
+          </w:tcPr>
+          <w:p>
+            <w:r/>
+            <w:r>
+              <w:rPr>
+                <w:strike/>
                 <w:color w:val="808080"/>
                 <w:sz w:val="18"/>
               </w:rPr>
@@ -6167,13 +6289,17 @@
         <w:tc>
           <w:tcPr>
             <w:tcW w:type="dxa" w:w="1814"/>
-          </w:tcPr>
-          <w:p>
-            <w:r/>
-            <w:r>
-              <w:rPr>
-                <w:sz w:val="18"/>
-              </w:rPr>
+            <w:shd w:val="clear" w:color="auto" w:fill="EFEFEF"/>
+          </w:tcPr>
+          <w:p>
+            <w:r/>
+            <w:r>
+              <w:rPr>
+                <w:b/>
+                <w:color w:val="1E7B34"/>
+                <w:sz w:val="18"/>
+              </w:rPr>
+              <w:t>NOT NEEDED ANY MORE (the endings changed)</w:t>
             </w:r>
           </w:p>
         </w:tc>
@@ -6831,6 +6957,391 @@
         <w:tc>
           <w:tcPr>
             <w:tcW w:type="dxa" w:w="1134"/>
+            <w:shd w:val="clear" w:color="auto" w:fill="EFEFEF"/>
+          </w:tcPr>
+          <w:p>
+            <w:r/>
+            <w:r>
+              <w:rPr>
+                <w:b/>
+                <w:strike/>
+                <w:color w:val="999999"/>
+                <w:sz w:val="20"/>
+              </w:rPr>
+              <w:t>audio58</w:t>
+            </w:r>
+          </w:p>
+        </w:tc>
+        <w:tc>
+          <w:tcPr>
+            <w:tcW w:type="dxa" w:w="3061"/>
+            <w:shd w:val="clear" w:color="auto" w:fill="EFEFEF"/>
+          </w:tcPr>
+          <w:p>
+            <w:r/>
+            <w:r>
+              <w:rPr>
+                <w:strike/>
+                <w:color w:val="999999"/>
+                <w:sz w:val="18"/>
+              </w:rPr>
+              <w:t>Ending 1, Luna smiles at him from her cradle</w:t>
+            </w:r>
+          </w:p>
+        </w:tc>
+        <w:tc>
+          <w:tcPr>
+            <w:tcW w:type="dxa" w:w="4649"/>
+            <w:shd w:val="clear" w:color="auto" w:fill="EFEFEF"/>
+          </w:tcPr>
+          <w:p>
+            <w:r/>
+            <w:r>
+              <w:rPr>
+                <w:strike/>
+                <w:color w:val="999999"/>
+                <w:sz w:val="18"/>
+              </w:rPr>
+              <w:t>The ghost, moved, whispering: "She smiles at me. She always knew I was here."</w:t>
+            </w:r>
+          </w:p>
+        </w:tc>
+        <w:tc>
+          <w:tcPr>
+            <w:tcW w:type="dxa" w:w="1247"/>
+            <w:shd w:val="clear" w:color="auto" w:fill="EFEFEF"/>
+          </w:tcPr>
+          <w:p>
+            <w:r/>
+            <w:r>
+              <w:rPr>
+                <w:strike/>
+                <w:color w:val="999999"/>
+                <w:sz w:val="18"/>
+              </w:rPr>
+              <w:t>4 s</w:t>
+            </w:r>
+          </w:p>
+        </w:tc>
+        <w:tc>
+          <w:tcPr>
+            <w:tcW w:type="dxa" w:w="1134"/>
+            <w:shd w:val="clear" w:color="auto" w:fill="E6EEF8"/>
+            <w:shd w:val="clear" w:color="auto" w:fill="EFEFEF"/>
+          </w:tcPr>
+          <w:p>
+            <w:r/>
+            <w:r>
+              <w:rPr>
+                <w:strike/>
+                <w:color w:val="999999"/>
+                <w:sz w:val="18"/>
+              </w:rPr>
+              <w:t>OPTIONAL</w:t>
+            </w:r>
+          </w:p>
+        </w:tc>
+        <w:tc>
+          <w:tcPr>
+            <w:tcW w:type="dxa" w:w="2041"/>
+            <w:shd w:val="clear" w:color="auto" w:fill="EFEFEF"/>
+          </w:tcPr>
+          <w:p>
+            <w:r/>
+            <w:r>
+              <w:rPr>
+                <w:strike/>
+                <w:color w:val="808080"/>
+                <w:sz w:val="18"/>
+              </w:rPr>
+              <w:t>voice_ghost_smile</w:t>
+            </w:r>
+          </w:p>
+        </w:tc>
+        <w:tc>
+          <w:tcPr>
+            <w:tcW w:type="dxa" w:w="1814"/>
+            <w:shd w:val="clear" w:color="auto" w:fill="EFEFEF"/>
+          </w:tcPr>
+          <w:p>
+            <w:r/>
+            <w:r>
+              <w:rPr>
+                <w:b/>
+                <w:color w:val="1E7B34"/>
+                <w:sz w:val="18"/>
+              </w:rPr>
+              <w:t>NOT NEEDED ANY MORE (the endings changed)</w:t>
+            </w:r>
+          </w:p>
+        </w:tc>
+      </w:tr>
+      <w:tr>
+        <w:tc>
+          <w:tcPr>
+            <w:tcW w:type="dxa" w:w="1134"/>
+            <w:shd w:val="clear" w:color="auto" w:fill="EFEFEF"/>
+          </w:tcPr>
+          <w:p>
+            <w:r/>
+            <w:r>
+              <w:rPr>
+                <w:b/>
+                <w:strike/>
+                <w:color w:val="999999"/>
+                <w:sz w:val="20"/>
+              </w:rPr>
+              <w:t>audio59</w:t>
+            </w:r>
+          </w:p>
+        </w:tc>
+        <w:tc>
+          <w:tcPr>
+            <w:tcW w:type="dxa" w:w="3061"/>
+            <w:shd w:val="clear" w:color="auto" w:fill="EFEFEF"/>
+          </w:tcPr>
+          <w:p>
+            <w:r/>
+            <w:r>
+              <w:rPr>
+                <w:strike/>
+                <w:color w:val="999999"/>
+                <w:sz w:val="18"/>
+              </w:rPr>
+              <w:t>Ending 2, Luna smiles at him from her cradle</w:t>
+            </w:r>
+          </w:p>
+        </w:tc>
+        <w:tc>
+          <w:tcPr>
+            <w:tcW w:type="dxa" w:w="4649"/>
+            <w:shd w:val="clear" w:color="auto" w:fill="EFEFEF"/>
+          </w:tcPr>
+          <w:p>
+            <w:r/>
+            <w:r>
+              <w:rPr>
+                <w:strike/>
+                <w:color w:val="999999"/>
+                <w:sz w:val="18"/>
+              </w:rPr>
+              <w:t>The ghost, softly: "For a moment, she sees me."</w:t>
+            </w:r>
+          </w:p>
+        </w:tc>
+        <w:tc>
+          <w:tcPr>
+            <w:tcW w:type="dxa" w:w="1247"/>
+            <w:shd w:val="clear" w:color="auto" w:fill="EFEFEF"/>
+          </w:tcPr>
+          <w:p>
+            <w:r/>
+            <w:r>
+              <w:rPr>
+                <w:strike/>
+                <w:color w:val="999999"/>
+                <w:sz w:val="18"/>
+              </w:rPr>
+              <w:t>3 s</w:t>
+            </w:r>
+          </w:p>
+        </w:tc>
+        <w:tc>
+          <w:tcPr>
+            <w:tcW w:type="dxa" w:w="1134"/>
+            <w:shd w:val="clear" w:color="auto" w:fill="E6EEF8"/>
+            <w:shd w:val="clear" w:color="auto" w:fill="EFEFEF"/>
+          </w:tcPr>
+          <w:p>
+            <w:r/>
+            <w:r>
+              <w:rPr>
+                <w:strike/>
+                <w:color w:val="999999"/>
+                <w:sz w:val="18"/>
+              </w:rPr>
+              <w:t>OPTIONAL</w:t>
+            </w:r>
+          </w:p>
+        </w:tc>
+        <w:tc>
+          <w:tcPr>
+            <w:tcW w:type="dxa" w:w="2041"/>
+            <w:shd w:val="clear" w:color="auto" w:fill="EFEFEF"/>
+          </w:tcPr>
+          <w:p>
+            <w:r/>
+            <w:r>
+              <w:rPr>
+                <w:strike/>
+                <w:color w:val="808080"/>
+                <w:sz w:val="18"/>
+              </w:rPr>
+              <w:t>voice_ghost_seesme</w:t>
+            </w:r>
+          </w:p>
+        </w:tc>
+        <w:tc>
+          <w:tcPr>
+            <w:tcW w:type="dxa" w:w="1814"/>
+            <w:shd w:val="clear" w:color="auto" w:fill="EFEFEF"/>
+          </w:tcPr>
+          <w:p>
+            <w:r/>
+            <w:r>
+              <w:rPr>
+                <w:b/>
+                <w:color w:val="1E7B34"/>
+                <w:sz w:val="18"/>
+              </w:rPr>
+              <w:t>NOT NEEDED ANY MORE (the endings changed)</w:t>
+            </w:r>
+          </w:p>
+        </w:tc>
+      </w:tr>
+    </w:tbl>
+    <w:p/>
+    <w:p>
+      <w:pPr>
+        <w:pStyle w:val="Heading1"/>
+      </w:pPr>
+      <w:r>
+        <w:t>G. NEW: dreams, the yard, the new endings (added later, numbers 1-59 did not change)</w:t>
+      </w:r>
+    </w:p>
+    <w:tbl>
+      <w:tblPr>
+        <w:tblStyle w:val="TableGrid"/>
+        <w:tblW w:type="auto" w:w="0"/>
+        <w:tblLook w:firstColumn="1" w:firstRow="1" w:lastColumn="0" w:lastRow="0" w:noHBand="0" w:noVBand="1" w:val="04A0"/>
+      </w:tblPr>
+      <w:tblGrid>
+        <w:gridCol w:w="2004"/>
+        <w:gridCol w:w="2004"/>
+        <w:gridCol w:w="2004"/>
+        <w:gridCol w:w="2004"/>
+        <w:gridCol w:w="2004"/>
+        <w:gridCol w:w="2004"/>
+        <w:gridCol w:w="2004"/>
+      </w:tblGrid>
+      <w:tr>
+        <w:tc>
+          <w:tcPr>
+            <w:tcW w:type="dxa" w:w="1134"/>
+            <w:shd w:val="clear" w:color="auto" w:fill="D9D9D9"/>
+          </w:tcPr>
+          <w:p>
+            <w:r/>
+            <w:r>
+              <w:rPr>
+                <w:b/>
+                <w:sz w:val="18"/>
+              </w:rPr>
+              <w:t>ID</w:t>
+            </w:r>
+          </w:p>
+        </w:tc>
+        <w:tc>
+          <w:tcPr>
+            <w:tcW w:type="dxa" w:w="3061"/>
+            <w:shd w:val="clear" w:color="auto" w:fill="D9D9D9"/>
+          </w:tcPr>
+          <w:p>
+            <w:r/>
+            <w:r>
+              <w:rPr>
+                <w:b/>
+                <w:sz w:val="18"/>
+              </w:rPr>
+              <w:t>Plays when</w:t>
+            </w:r>
+          </w:p>
+        </w:tc>
+        <w:tc>
+          <w:tcPr>
+            <w:tcW w:type="dxa" w:w="4649"/>
+            <w:shd w:val="clear" w:color="auto" w:fill="D9D9D9"/>
+          </w:tcPr>
+          <w:p>
+            <w:r/>
+            <w:r>
+              <w:rPr>
+                <w:b/>
+                <w:sz w:val="18"/>
+              </w:rPr>
+              <w:t>It should sound like</w:t>
+            </w:r>
+          </w:p>
+        </w:tc>
+        <w:tc>
+          <w:tcPr>
+            <w:tcW w:type="dxa" w:w="1247"/>
+            <w:shd w:val="clear" w:color="auto" w:fill="D9D9D9"/>
+          </w:tcPr>
+          <w:p>
+            <w:r/>
+            <w:r>
+              <w:rPr>
+                <w:b/>
+                <w:sz w:val="18"/>
+              </w:rPr>
+              <w:t>Length</w:t>
+            </w:r>
+          </w:p>
+        </w:tc>
+        <w:tc>
+          <w:tcPr>
+            <w:tcW w:type="dxa" w:w="1134"/>
+            <w:shd w:val="clear" w:color="auto" w:fill="D9D9D9"/>
+          </w:tcPr>
+          <w:p>
+            <w:r/>
+            <w:r>
+              <w:rPr>
+                <w:b/>
+                <w:sz w:val="18"/>
+              </w:rPr>
+              <w:t>Priority</w:t>
+            </w:r>
+          </w:p>
+        </w:tc>
+        <w:tc>
+          <w:tcPr>
+            <w:tcW w:type="dxa" w:w="2041"/>
+            <w:shd w:val="clear" w:color="auto" w:fill="D9D9D9"/>
+          </w:tcPr>
+          <w:p>
+            <w:r/>
+            <w:r>
+              <w:rPr>
+                <w:b/>
+                <w:sz w:val="18"/>
+              </w:rPr>
+              <w:t>Code name (for me)</w:t>
+            </w:r>
+          </w:p>
+        </w:tc>
+        <w:tc>
+          <w:tcPr>
+            <w:tcW w:type="dxa" w:w="1814"/>
+            <w:shd w:val="clear" w:color="auto" w:fill="D9D9D9"/>
+          </w:tcPr>
+          <w:p>
+            <w:r/>
+            <w:r>
+              <w:rPr>
+                <w:b/>
+                <w:sz w:val="18"/>
+              </w:rPr>
+              <w:t>Your notes</w:t>
+            </w:r>
+          </w:p>
+        </w:tc>
+      </w:tr>
+      <w:tr>
+        <w:tc>
+          <w:tcPr>
+            <w:tcW w:type="dxa" w:w="1134"/>
           </w:tcPr>
           <w:p>
             <w:r/>
@@ -6839,7 +7350,7 @@
                 <w:b/>
                 <w:sz w:val="20"/>
               </w:rPr>
-              <w:t>audio58</w:t>
+              <w:t>audio60</w:t>
             </w:r>
           </w:p>
         </w:tc>
@@ -6853,7 +7364,7 @@
               <w:rPr>
                 <w:sz w:val="18"/>
               </w:rPr>
-              <w:t>Ending 1, Luna smiles at him from her cradle</w:t>
+              <w:t>The six dream cutscenes at night</w:t>
             </w:r>
           </w:p>
         </w:tc>
@@ -6867,7 +7378,7 @@
               <w:rPr>
                 <w:sz w:val="18"/>
               </w:rPr>
-              <w:t>The ghost, moved, whispering: "She smiles at me. She always knew I was here."</w:t>
+              <w:t>Soft, floating, warm. Music box or piano with a light echo, like a memory.</w:t>
             </w:r>
           </w:p>
         </w:tc>
@@ -6881,7 +7392,517 @@
               <w:rPr>
                 <w:sz w:val="18"/>
               </w:rPr>
-              <w:t>4 s</w:t>
+              <w:t>1-2 min, loop</w:t>
+            </w:r>
+          </w:p>
+        </w:tc>
+        <w:tc>
+          <w:tcPr>
+            <w:tcW w:type="dxa" w:w="1134"/>
+            <w:shd w:val="clear" w:color="auto" w:fill="F8D7D7"/>
+          </w:tcPr>
+          <w:p>
+            <w:r/>
+            <w:r>
+              <w:rPr>
+                <w:sz w:val="18"/>
+              </w:rPr>
+              <w:t>MUST</w:t>
+            </w:r>
+          </w:p>
+        </w:tc>
+        <w:tc>
+          <w:tcPr>
+            <w:tcW w:type="dxa" w:w="2041"/>
+          </w:tcPr>
+          <w:p>
+            <w:r/>
+            <w:r>
+              <w:rPr>
+                <w:color w:val="808080"/>
+                <w:sz w:val="18"/>
+              </w:rPr>
+              <w:t>music_dream</w:t>
+            </w:r>
+          </w:p>
+        </w:tc>
+        <w:tc>
+          <w:tcPr>
+            <w:tcW w:type="dxa" w:w="1814"/>
+          </w:tcPr>
+          <w:p>
+            <w:r/>
+            <w:r>
+              <w:rPr>
+                <w:sz w:val="18"/>
+              </w:rPr>
+            </w:r>
+          </w:p>
+        </w:tc>
+      </w:tr>
+      <w:tr>
+        <w:tc>
+          <w:tcPr>
+            <w:tcW w:type="dxa" w:w="1134"/>
+          </w:tcPr>
+          <w:p>
+            <w:r/>
+            <w:r>
+              <w:rPr>
+                <w:b/>
+                <w:sz w:val="20"/>
+              </w:rPr>
+              <w:t>audio61</w:t>
+            </w:r>
+          </w:p>
+        </w:tc>
+        <w:tc>
+          <w:tcPr>
+            <w:tcW w:type="dxa" w:w="3061"/>
+          </w:tcPr>
+          <w:p>
+            <w:r/>
+            <w:r>
+              <w:rPr>
+                <w:sz w:val="18"/>
+              </w:rPr>
+              <w:t>The swings in the back yard playground (they sway at night)</w:t>
+            </w:r>
+          </w:p>
+        </w:tc>
+        <w:tc>
+          <w:tcPr>
+            <w:tcW w:type="dxa" w:w="4649"/>
+          </w:tcPr>
+          <w:p>
+            <w:r/>
+            <w:r>
+              <w:rPr>
+                <w:sz w:val="18"/>
+              </w:rPr>
+              <w:t>A slow metal swing creaking back and forth.</w:t>
+            </w:r>
+          </w:p>
+        </w:tc>
+        <w:tc>
+          <w:tcPr>
+            <w:tcW w:type="dxa" w:w="1247"/>
+          </w:tcPr>
+          <w:p>
+            <w:r/>
+            <w:r>
+              <w:rPr>
+                <w:sz w:val="18"/>
+              </w:rPr>
+              <w:t>3-6 s, loop</w:t>
+            </w:r>
+          </w:p>
+        </w:tc>
+        <w:tc>
+          <w:tcPr>
+            <w:tcW w:type="dxa" w:w="1134"/>
+            <w:shd w:val="clear" w:color="auto" w:fill="FFF3CC"/>
+          </w:tcPr>
+          <w:p>
+            <w:r/>
+            <w:r>
+              <w:rPr>
+                <w:sz w:val="18"/>
+              </w:rPr>
+              <w:t>NICE</w:t>
+            </w:r>
+          </w:p>
+        </w:tc>
+        <w:tc>
+          <w:tcPr>
+            <w:tcW w:type="dxa" w:w="2041"/>
+          </w:tcPr>
+          <w:p>
+            <w:r/>
+            <w:r>
+              <w:rPr>
+                <w:color w:val="808080"/>
+                <w:sz w:val="18"/>
+              </w:rPr>
+              <w:t>swing_creak</w:t>
+            </w:r>
+          </w:p>
+        </w:tc>
+        <w:tc>
+          <w:tcPr>
+            <w:tcW w:type="dxa" w:w="1814"/>
+          </w:tcPr>
+          <w:p>
+            <w:r/>
+            <w:r>
+              <w:rPr>
+                <w:sz w:val="18"/>
+              </w:rPr>
+            </w:r>
+          </w:p>
+        </w:tc>
+      </w:tr>
+      <w:tr>
+        <w:tc>
+          <w:tcPr>
+            <w:tcW w:type="dxa" w:w="1134"/>
+          </w:tcPr>
+          <w:p>
+            <w:r/>
+            <w:r>
+              <w:rPr>
+                <w:b/>
+                <w:sz w:val="20"/>
+              </w:rPr>
+              <w:t>audio62</w:t>
+            </w:r>
+          </w:p>
+        </w:tc>
+        <w:tc>
+          <w:tcPr>
+            <w:tcW w:type="dxa" w:w="3061"/>
+          </w:tcPr>
+          <w:p>
+            <w:r/>
+            <w:r>
+              <w:rPr>
+                <w:sz w:val="18"/>
+              </w:rPr>
+              <w:t>Mom or Luna noticed you (points on a bar). A made-up chime plays until this exists.</w:t>
+            </w:r>
+          </w:p>
+        </w:tc>
+        <w:tc>
+          <w:tcPr>
+            <w:tcW w:type="dxa" w:w="4649"/>
+          </w:tcPr>
+          <w:p>
+            <w:r/>
+            <w:r>
+              <w:rPr>
+                <w:sz w:val="18"/>
+              </w:rPr>
+              <w:t>Two soft bell notes, gentle and warm.</w:t>
+            </w:r>
+          </w:p>
+        </w:tc>
+        <w:tc>
+          <w:tcPr>
+            <w:tcW w:type="dxa" w:w="1247"/>
+          </w:tcPr>
+          <w:p>
+            <w:r/>
+            <w:r>
+              <w:rPr>
+                <w:sz w:val="18"/>
+              </w:rPr>
+              <w:t>1 s</w:t>
+            </w:r>
+          </w:p>
+        </w:tc>
+        <w:tc>
+          <w:tcPr>
+            <w:tcW w:type="dxa" w:w="1134"/>
+            <w:shd w:val="clear" w:color="auto" w:fill="FFF3CC"/>
+          </w:tcPr>
+          <w:p>
+            <w:r/>
+            <w:r>
+              <w:rPr>
+                <w:sz w:val="18"/>
+              </w:rPr>
+              <w:t>NICE</w:t>
+            </w:r>
+          </w:p>
+        </w:tc>
+        <w:tc>
+          <w:tcPr>
+            <w:tcW w:type="dxa" w:w="2041"/>
+          </w:tcPr>
+          <w:p>
+            <w:r/>
+            <w:r>
+              <w:rPr>
+                <w:color w:val="808080"/>
+                <w:sz w:val="18"/>
+              </w:rPr>
+              <w:t>notice_chime</w:t>
+            </w:r>
+          </w:p>
+        </w:tc>
+        <w:tc>
+          <w:tcPr>
+            <w:tcW w:type="dxa" w:w="1814"/>
+          </w:tcPr>
+          <w:p>
+            <w:r/>
+            <w:r>
+              <w:rPr>
+                <w:sz w:val="18"/>
+              </w:rPr>
+            </w:r>
+          </w:p>
+        </w:tc>
+      </w:tr>
+      <w:tr>
+        <w:tc>
+          <w:tcPr>
+            <w:tcW w:type="dxa" w:w="1134"/>
+          </w:tcPr>
+          <w:p>
+            <w:r/>
+            <w:r>
+              <w:rPr>
+                <w:b/>
+                <w:sz w:val="20"/>
+              </w:rPr>
+              <w:t>audio63</w:t>
+            </w:r>
+          </w:p>
+        </w:tc>
+        <w:tc>
+          <w:tcPr>
+            <w:tcW w:type="dxa" w:w="3061"/>
+          </w:tcPr>
+          <w:p>
+            <w:r/>
+            <w:r>
+              <w:rPr>
+                <w:sz w:val="18"/>
+              </w:rPr>
+              <w:t>You gather a memory light at night. A made-up sound plays until this exists.</w:t>
+            </w:r>
+          </w:p>
+        </w:tc>
+        <w:tc>
+          <w:tcPr>
+            <w:tcW w:type="dxa" w:w="4649"/>
+          </w:tcPr>
+          <w:p>
+            <w:r/>
+            <w:r>
+              <w:rPr>
+                <w:sz w:val="18"/>
+              </w:rPr>
+              <w:t>A light, rising sparkle of three bell notes.</w:t>
+            </w:r>
+          </w:p>
+        </w:tc>
+        <w:tc>
+          <w:tcPr>
+            <w:tcW w:type="dxa" w:w="1247"/>
+          </w:tcPr>
+          <w:p>
+            <w:r/>
+            <w:r>
+              <w:rPr>
+                <w:sz w:val="18"/>
+              </w:rPr>
+              <w:t>1 s</w:t>
+            </w:r>
+          </w:p>
+        </w:tc>
+        <w:tc>
+          <w:tcPr>
+            <w:tcW w:type="dxa" w:w="1134"/>
+            <w:shd w:val="clear" w:color="auto" w:fill="FFF3CC"/>
+          </w:tcPr>
+          <w:p>
+            <w:r/>
+            <w:r>
+              <w:rPr>
+                <w:sz w:val="18"/>
+              </w:rPr>
+              <w:t>NICE</w:t>
+            </w:r>
+          </w:p>
+        </w:tc>
+        <w:tc>
+          <w:tcPr>
+            <w:tcW w:type="dxa" w:w="2041"/>
+          </w:tcPr>
+          <w:p>
+            <w:r/>
+            <w:r>
+              <w:rPr>
+                <w:color w:val="808080"/>
+                <w:sz w:val="18"/>
+              </w:rPr>
+              <w:t>memory_collect</w:t>
+            </w:r>
+          </w:p>
+        </w:tc>
+        <w:tc>
+          <w:tcPr>
+            <w:tcW w:type="dxa" w:w="1814"/>
+          </w:tcPr>
+          <w:p>
+            <w:r/>
+            <w:r>
+              <w:rPr>
+                <w:sz w:val="18"/>
+              </w:rPr>
+            </w:r>
+          </w:p>
+        </w:tc>
+      </w:tr>
+      <w:tr>
+        <w:tc>
+          <w:tcPr>
+            <w:tcW w:type="dxa" w:w="1134"/>
+          </w:tcPr>
+          <w:p>
+            <w:r/>
+            <w:r>
+              <w:rPr>
+                <w:b/>
+                <w:sz w:val="20"/>
+              </w:rPr>
+              <w:t>audio64</w:t>
+            </w:r>
+          </w:p>
+        </w:tc>
+        <w:tc>
+          <w:tcPr>
+            <w:tcW w:type="dxa" w:w="3061"/>
+          </w:tcPr>
+          <w:p>
+            <w:r/>
+            <w:r>
+              <w:rPr>
+                <w:sz w:val="18"/>
+              </w:rPr>
+              <w:t>A dream begins / a bar becomes full. A made-up sound plays until this exists.</w:t>
+            </w:r>
+          </w:p>
+        </w:tc>
+        <w:tc>
+          <w:tcPr>
+            <w:tcW w:type="dxa" w:w="4649"/>
+          </w:tcPr>
+          <w:p>
+            <w:r/>
+            <w:r>
+              <w:rPr>
+                <w:sz w:val="18"/>
+              </w:rPr>
+              <w:t>A warm, swelling chord, like breathing in.</w:t>
+            </w:r>
+          </w:p>
+        </w:tc>
+        <w:tc>
+          <w:tcPr>
+            <w:tcW w:type="dxa" w:w="1247"/>
+          </w:tcPr>
+          <w:p>
+            <w:r/>
+            <w:r>
+              <w:rPr>
+                <w:sz w:val="18"/>
+              </w:rPr>
+              <w:t>3 s</w:t>
+            </w:r>
+          </w:p>
+        </w:tc>
+        <w:tc>
+          <w:tcPr>
+            <w:tcW w:type="dxa" w:w="1134"/>
+            <w:shd w:val="clear" w:color="auto" w:fill="FFF3CC"/>
+          </w:tcPr>
+          <w:p>
+            <w:r/>
+            <w:r>
+              <w:rPr>
+                <w:sz w:val="18"/>
+              </w:rPr>
+              <w:t>NICE</w:t>
+            </w:r>
+          </w:p>
+        </w:tc>
+        <w:tc>
+          <w:tcPr>
+            <w:tcW w:type="dxa" w:w="2041"/>
+          </w:tcPr>
+          <w:p>
+            <w:r/>
+            <w:r>
+              <w:rPr>
+                <w:color w:val="808080"/>
+                <w:sz w:val="18"/>
+              </w:rPr>
+              <w:t>dream_swell</w:t>
+            </w:r>
+          </w:p>
+        </w:tc>
+        <w:tc>
+          <w:tcPr>
+            <w:tcW w:type="dxa" w:w="1814"/>
+          </w:tcPr>
+          <w:p>
+            <w:r/>
+            <w:r>
+              <w:rPr>
+                <w:sz w:val="18"/>
+              </w:rPr>
+            </w:r>
+          </w:p>
+        </w:tc>
+      </w:tr>
+      <w:tr>
+        <w:tc>
+          <w:tcPr>
+            <w:tcW w:type="dxa" w:w="1134"/>
+          </w:tcPr>
+          <w:p>
+            <w:r/>
+            <w:r>
+              <w:rPr>
+                <w:b/>
+                <w:sz w:val="20"/>
+              </w:rPr>
+              <w:t>audio65</w:t>
+            </w:r>
+          </w:p>
+        </w:tc>
+        <w:tc>
+          <w:tcPr>
+            <w:tcW w:type="dxa" w:w="3061"/>
+          </w:tcPr>
+          <w:p>
+            <w:r/>
+            <w:r>
+              <w:rPr>
+                <w:sz w:val="18"/>
+              </w:rPr>
+              <w:t>Dream, night 1 (Mom): the first dance</w:t>
+            </w:r>
+          </w:p>
+        </w:tc>
+        <w:tc>
+          <w:tcPr>
+            <w:tcW w:type="dxa" w:w="4649"/>
+          </w:tcPr>
+          <w:p>
+            <w:r/>
+            <w:r>
+              <w:rPr>
+                <w:sz w:val="18"/>
+              </w:rPr>
+              <w:t>Mom, smiling: "You always stepped on my feet."</w:t>
+            </w:r>
+          </w:p>
+        </w:tc>
+        <w:tc>
+          <w:tcPr>
+            <w:tcW w:type="dxa" w:w="1247"/>
+          </w:tcPr>
+          <w:p>
+            <w:r/>
+            <w:r>
+              <w:rPr>
+                <w:sz w:val="18"/>
+              </w:rPr>
+              <w:t>3 s</w:t>
             </w:r>
           </w:p>
         </w:tc>
@@ -6911,7 +7932,7 @@
                 <w:color w:val="808080"/>
                 <w:sz w:val="18"/>
               </w:rPr>
-              <w:t>voice_ghost_smile</w:t>
+              <w:t>voice_dream_mom1_a</w:t>
             </w:r>
           </w:p>
         </w:tc>
@@ -6941,7 +7962,7 @@
                 <w:b/>
                 <w:sz w:val="20"/>
               </w:rPr>
-              <w:t>audio59</w:t>
+              <w:t>audio66</w:t>
             </w:r>
           </w:p>
         </w:tc>
@@ -6955,7 +7976,7 @@
               <w:rPr>
                 <w:sz w:val="18"/>
               </w:rPr>
-              <w:t>Ending 2, Luna smiles at him from her cradle</w:t>
+              <w:t>Dream, night 1 (Mom)</w:t>
             </w:r>
           </w:p>
         </w:tc>
@@ -6969,7 +7990,7 @@
               <w:rPr>
                 <w:sz w:val="18"/>
               </w:rPr>
-              <w:t>The ghost, softly: "For a moment, she sees me."</w:t>
+              <w:t>Father (the ghost), warm: "I was nervous. I still am."</w:t>
             </w:r>
           </w:p>
         </w:tc>
@@ -7013,7 +8034,2149 @@
                 <w:color w:val="808080"/>
                 <w:sz w:val="18"/>
               </w:rPr>
-              <w:t>voice_ghost_seesme</w:t>
+              <w:t>voice_dream_mom1_b</w:t>
+            </w:r>
+          </w:p>
+        </w:tc>
+        <w:tc>
+          <w:tcPr>
+            <w:tcW w:type="dxa" w:w="1814"/>
+          </w:tcPr>
+          <w:p>
+            <w:r/>
+            <w:r>
+              <w:rPr>
+                <w:sz w:val="18"/>
+              </w:rPr>
+            </w:r>
+          </w:p>
+        </w:tc>
+      </w:tr>
+      <w:tr>
+        <w:tc>
+          <w:tcPr>
+            <w:tcW w:type="dxa" w:w="1134"/>
+          </w:tcPr>
+          <w:p>
+            <w:r/>
+            <w:r>
+              <w:rPr>
+                <w:b/>
+                <w:sz w:val="20"/>
+              </w:rPr>
+              <w:t>audio67</w:t>
+            </w:r>
+          </w:p>
+        </w:tc>
+        <w:tc>
+          <w:tcPr>
+            <w:tcW w:type="dxa" w:w="3061"/>
+          </w:tcPr>
+          <w:p>
+            <w:r/>
+            <w:r>
+              <w:rPr>
+                <w:sz w:val="18"/>
+              </w:rPr>
+              <w:t>Dream, night 1 (Mom)</w:t>
+            </w:r>
+          </w:p>
+        </w:tc>
+        <w:tc>
+          <w:tcPr>
+            <w:tcW w:type="dxa" w:w="4649"/>
+          </w:tcPr>
+          <w:p>
+            <w:r/>
+            <w:r>
+              <w:rPr>
+                <w:sz w:val="18"/>
+              </w:rPr>
+              <w:t>Mom, soft: "Stay a little longer... please."</w:t>
+            </w:r>
+          </w:p>
+        </w:tc>
+        <w:tc>
+          <w:tcPr>
+            <w:tcW w:type="dxa" w:w="1247"/>
+          </w:tcPr>
+          <w:p>
+            <w:r/>
+            <w:r>
+              <w:rPr>
+                <w:sz w:val="18"/>
+              </w:rPr>
+              <w:t>3 s</w:t>
+            </w:r>
+          </w:p>
+        </w:tc>
+        <w:tc>
+          <w:tcPr>
+            <w:tcW w:type="dxa" w:w="1134"/>
+            <w:shd w:val="clear" w:color="auto" w:fill="E6EEF8"/>
+          </w:tcPr>
+          <w:p>
+            <w:r/>
+            <w:r>
+              <w:rPr>
+                <w:sz w:val="18"/>
+              </w:rPr>
+              <w:t>OPTIONAL</w:t>
+            </w:r>
+          </w:p>
+        </w:tc>
+        <w:tc>
+          <w:tcPr>
+            <w:tcW w:type="dxa" w:w="2041"/>
+          </w:tcPr>
+          <w:p>
+            <w:r/>
+            <w:r>
+              <w:rPr>
+                <w:color w:val="808080"/>
+                <w:sz w:val="18"/>
+              </w:rPr>
+              <w:t>voice_dream_mom1_c</w:t>
+            </w:r>
+          </w:p>
+        </w:tc>
+        <w:tc>
+          <w:tcPr>
+            <w:tcW w:type="dxa" w:w="1814"/>
+          </w:tcPr>
+          <w:p>
+            <w:r/>
+            <w:r>
+              <w:rPr>
+                <w:sz w:val="18"/>
+              </w:rPr>
+            </w:r>
+          </w:p>
+        </w:tc>
+      </w:tr>
+      <w:tr>
+        <w:tc>
+          <w:tcPr>
+            <w:tcW w:type="dxa" w:w="1134"/>
+          </w:tcPr>
+          <w:p>
+            <w:r/>
+            <w:r>
+              <w:rPr>
+                <w:b/>
+                <w:sz w:val="20"/>
+              </w:rPr>
+              <w:t>audio68</w:t>
+            </w:r>
+          </w:p>
+        </w:tc>
+        <w:tc>
+          <w:tcPr>
+            <w:tcW w:type="dxa" w:w="3061"/>
+          </w:tcPr>
+          <w:p>
+            <w:r/>
+            <w:r>
+              <w:rPr>
+                <w:sz w:val="18"/>
+              </w:rPr>
+              <w:t>Dream, night 2 (Mom): morning coffee</w:t>
+            </w:r>
+          </w:p>
+        </w:tc>
+        <w:tc>
+          <w:tcPr>
+            <w:tcW w:type="dxa" w:w="4649"/>
+          </w:tcPr>
+          <w:p>
+            <w:r/>
+            <w:r>
+              <w:rPr>
+                <w:sz w:val="18"/>
+              </w:rPr>
+              <w:t>Mom, teasing: "You always made the coffee too strong."</w:t>
+            </w:r>
+          </w:p>
+        </w:tc>
+        <w:tc>
+          <w:tcPr>
+            <w:tcW w:type="dxa" w:w="1247"/>
+          </w:tcPr>
+          <w:p>
+            <w:r/>
+            <w:r>
+              <w:rPr>
+                <w:sz w:val="18"/>
+              </w:rPr>
+              <w:t>3 s</w:t>
+            </w:r>
+          </w:p>
+        </w:tc>
+        <w:tc>
+          <w:tcPr>
+            <w:tcW w:type="dxa" w:w="1134"/>
+            <w:shd w:val="clear" w:color="auto" w:fill="E6EEF8"/>
+          </w:tcPr>
+          <w:p>
+            <w:r/>
+            <w:r>
+              <w:rPr>
+                <w:sz w:val="18"/>
+              </w:rPr>
+              <w:t>OPTIONAL</w:t>
+            </w:r>
+          </w:p>
+        </w:tc>
+        <w:tc>
+          <w:tcPr>
+            <w:tcW w:type="dxa" w:w="2041"/>
+          </w:tcPr>
+          <w:p>
+            <w:r/>
+            <w:r>
+              <w:rPr>
+                <w:color w:val="808080"/>
+                <w:sz w:val="18"/>
+              </w:rPr>
+              <w:t>voice_dream_mom2_a</w:t>
+            </w:r>
+          </w:p>
+        </w:tc>
+        <w:tc>
+          <w:tcPr>
+            <w:tcW w:type="dxa" w:w="1814"/>
+          </w:tcPr>
+          <w:p>
+            <w:r/>
+            <w:r>
+              <w:rPr>
+                <w:sz w:val="18"/>
+              </w:rPr>
+            </w:r>
+          </w:p>
+        </w:tc>
+      </w:tr>
+      <w:tr>
+        <w:tc>
+          <w:tcPr>
+            <w:tcW w:type="dxa" w:w="1134"/>
+          </w:tcPr>
+          <w:p>
+            <w:r/>
+            <w:r>
+              <w:rPr>
+                <w:b/>
+                <w:sz w:val="20"/>
+              </w:rPr>
+              <w:t>audio69</w:t>
+            </w:r>
+          </w:p>
+        </w:tc>
+        <w:tc>
+          <w:tcPr>
+            <w:tcW w:type="dxa" w:w="3061"/>
+          </w:tcPr>
+          <w:p>
+            <w:r/>
+            <w:r>
+              <w:rPr>
+                <w:sz w:val="18"/>
+              </w:rPr>
+              <w:t>Dream, night 2 (Mom)</w:t>
+            </w:r>
+          </w:p>
+        </w:tc>
+        <w:tc>
+          <w:tcPr>
+            <w:tcW w:type="dxa" w:w="4649"/>
+          </w:tcPr>
+          <w:p>
+            <w:r/>
+            <w:r>
+              <w:rPr>
+                <w:sz w:val="18"/>
+              </w:rPr>
+              <w:t>Father: "And you drank it anyway."</w:t>
+            </w:r>
+          </w:p>
+        </w:tc>
+        <w:tc>
+          <w:tcPr>
+            <w:tcW w:type="dxa" w:w="1247"/>
+          </w:tcPr>
+          <w:p>
+            <w:r/>
+            <w:r>
+              <w:rPr>
+                <w:sz w:val="18"/>
+              </w:rPr>
+              <w:t>2 s</w:t>
+            </w:r>
+          </w:p>
+        </w:tc>
+        <w:tc>
+          <w:tcPr>
+            <w:tcW w:type="dxa" w:w="1134"/>
+            <w:shd w:val="clear" w:color="auto" w:fill="E6EEF8"/>
+          </w:tcPr>
+          <w:p>
+            <w:r/>
+            <w:r>
+              <w:rPr>
+                <w:sz w:val="18"/>
+              </w:rPr>
+              <w:t>OPTIONAL</w:t>
+            </w:r>
+          </w:p>
+        </w:tc>
+        <w:tc>
+          <w:tcPr>
+            <w:tcW w:type="dxa" w:w="2041"/>
+          </w:tcPr>
+          <w:p>
+            <w:r/>
+            <w:r>
+              <w:rPr>
+                <w:color w:val="808080"/>
+                <w:sz w:val="18"/>
+              </w:rPr>
+              <w:t>voice_dream_mom2_b</w:t>
+            </w:r>
+          </w:p>
+        </w:tc>
+        <w:tc>
+          <w:tcPr>
+            <w:tcW w:type="dxa" w:w="1814"/>
+          </w:tcPr>
+          <w:p>
+            <w:r/>
+            <w:r>
+              <w:rPr>
+                <w:sz w:val="18"/>
+              </w:rPr>
+            </w:r>
+          </w:p>
+        </w:tc>
+      </w:tr>
+      <w:tr>
+        <w:tc>
+          <w:tcPr>
+            <w:tcW w:type="dxa" w:w="1134"/>
+          </w:tcPr>
+          <w:p>
+            <w:r/>
+            <w:r>
+              <w:rPr>
+                <w:b/>
+                <w:sz w:val="20"/>
+              </w:rPr>
+              <w:t>audio70</w:t>
+            </w:r>
+          </w:p>
+        </w:tc>
+        <w:tc>
+          <w:tcPr>
+            <w:tcW w:type="dxa" w:w="3061"/>
+          </w:tcPr>
+          <w:p>
+            <w:r/>
+            <w:r>
+              <w:rPr>
+                <w:sz w:val="18"/>
+              </w:rPr>
+              <w:t>Dream, night 2 (Mom)</w:t>
+            </w:r>
+          </w:p>
+        </w:tc>
+        <w:tc>
+          <w:tcPr>
+            <w:tcW w:type="dxa" w:w="4649"/>
+          </w:tcPr>
+          <w:p>
+            <w:r/>
+            <w:r>
+              <w:rPr>
+                <w:sz w:val="18"/>
+              </w:rPr>
+              <w:t>Mom, sad smile: "I still make two cups."</w:t>
+            </w:r>
+          </w:p>
+        </w:tc>
+        <w:tc>
+          <w:tcPr>
+            <w:tcW w:type="dxa" w:w="1247"/>
+          </w:tcPr>
+          <w:p>
+            <w:r/>
+            <w:r>
+              <w:rPr>
+                <w:sz w:val="18"/>
+              </w:rPr>
+              <w:t>3 s</w:t>
+            </w:r>
+          </w:p>
+        </w:tc>
+        <w:tc>
+          <w:tcPr>
+            <w:tcW w:type="dxa" w:w="1134"/>
+            <w:shd w:val="clear" w:color="auto" w:fill="E6EEF8"/>
+          </w:tcPr>
+          <w:p>
+            <w:r/>
+            <w:r>
+              <w:rPr>
+                <w:sz w:val="18"/>
+              </w:rPr>
+              <w:t>OPTIONAL</w:t>
+            </w:r>
+          </w:p>
+        </w:tc>
+        <w:tc>
+          <w:tcPr>
+            <w:tcW w:type="dxa" w:w="2041"/>
+          </w:tcPr>
+          <w:p>
+            <w:r/>
+            <w:r>
+              <w:rPr>
+                <w:color w:val="808080"/>
+                <w:sz w:val="18"/>
+              </w:rPr>
+              <w:t>voice_dream_mom2_c</w:t>
+            </w:r>
+          </w:p>
+        </w:tc>
+        <w:tc>
+          <w:tcPr>
+            <w:tcW w:type="dxa" w:w="1814"/>
+          </w:tcPr>
+          <w:p>
+            <w:r/>
+            <w:r>
+              <w:rPr>
+                <w:sz w:val="18"/>
+              </w:rPr>
+            </w:r>
+          </w:p>
+        </w:tc>
+      </w:tr>
+      <w:tr>
+        <w:tc>
+          <w:tcPr>
+            <w:tcW w:type="dxa" w:w="1134"/>
+          </w:tcPr>
+          <w:p>
+            <w:r/>
+            <w:r>
+              <w:rPr>
+                <w:b/>
+                <w:sz w:val="20"/>
+              </w:rPr>
+              <w:t>audio71</w:t>
+            </w:r>
+          </w:p>
+        </w:tc>
+        <w:tc>
+          <w:tcPr>
+            <w:tcW w:type="dxa" w:w="3061"/>
+          </w:tcPr>
+          <w:p>
+            <w:r/>
+            <w:r>
+              <w:rPr>
+                <w:sz w:val="18"/>
+              </w:rPr>
+              <w:t>Dream, night 3 (Mom): the porch</w:t>
+            </w:r>
+          </w:p>
+        </w:tc>
+        <w:tc>
+          <w:tcPr>
+            <w:tcW w:type="dxa" w:w="4649"/>
+          </w:tcPr>
+          <w:p>
+            <w:r/>
+            <w:r>
+              <w:rPr>
+                <w:sz w:val="18"/>
+              </w:rPr>
+              <w:t>Mom, quiet: "Tomorrow we leave this house."</w:t>
+            </w:r>
+          </w:p>
+        </w:tc>
+        <w:tc>
+          <w:tcPr>
+            <w:tcW w:type="dxa" w:w="1247"/>
+          </w:tcPr>
+          <w:p>
+            <w:r/>
+            <w:r>
+              <w:rPr>
+                <w:sz w:val="18"/>
+              </w:rPr>
+              <w:t>3 s</w:t>
+            </w:r>
+          </w:p>
+        </w:tc>
+        <w:tc>
+          <w:tcPr>
+            <w:tcW w:type="dxa" w:w="1134"/>
+            <w:shd w:val="clear" w:color="auto" w:fill="E6EEF8"/>
+          </w:tcPr>
+          <w:p>
+            <w:r/>
+            <w:r>
+              <w:rPr>
+                <w:sz w:val="18"/>
+              </w:rPr>
+              <w:t>OPTIONAL</w:t>
+            </w:r>
+          </w:p>
+        </w:tc>
+        <w:tc>
+          <w:tcPr>
+            <w:tcW w:type="dxa" w:w="2041"/>
+          </w:tcPr>
+          <w:p>
+            <w:r/>
+            <w:r>
+              <w:rPr>
+                <w:color w:val="808080"/>
+                <w:sz w:val="18"/>
+              </w:rPr>
+              <w:t>voice_dream_mom3_a</w:t>
+            </w:r>
+          </w:p>
+        </w:tc>
+        <w:tc>
+          <w:tcPr>
+            <w:tcW w:type="dxa" w:w="1814"/>
+          </w:tcPr>
+          <w:p>
+            <w:r/>
+            <w:r>
+              <w:rPr>
+                <w:sz w:val="18"/>
+              </w:rPr>
+            </w:r>
+          </w:p>
+        </w:tc>
+      </w:tr>
+      <w:tr>
+        <w:tc>
+          <w:tcPr>
+            <w:tcW w:type="dxa" w:w="1134"/>
+          </w:tcPr>
+          <w:p>
+            <w:r/>
+            <w:r>
+              <w:rPr>
+                <w:b/>
+                <w:sz w:val="20"/>
+              </w:rPr>
+              <w:t>audio72</w:t>
+            </w:r>
+          </w:p>
+        </w:tc>
+        <w:tc>
+          <w:tcPr>
+            <w:tcW w:type="dxa" w:w="3061"/>
+          </w:tcPr>
+          <w:p>
+            <w:r/>
+            <w:r>
+              <w:rPr>
+                <w:sz w:val="18"/>
+              </w:rPr>
+              <w:t>Dream, night 3 (Mom)</w:t>
+            </w:r>
+          </w:p>
+        </w:tc>
+        <w:tc>
+          <w:tcPr>
+            <w:tcW w:type="dxa" w:w="4649"/>
+          </w:tcPr>
+          <w:p>
+            <w:r/>
+            <w:r>
+              <w:rPr>
+                <w:sz w:val="18"/>
+              </w:rPr>
+              <w:t>Father: "The house was never what I loved."</w:t>
+            </w:r>
+          </w:p>
+        </w:tc>
+        <w:tc>
+          <w:tcPr>
+            <w:tcW w:type="dxa" w:w="1247"/>
+          </w:tcPr>
+          <w:p>
+            <w:r/>
+            <w:r>
+              <w:rPr>
+                <w:sz w:val="18"/>
+              </w:rPr>
+              <w:t>3 s</w:t>
+            </w:r>
+          </w:p>
+        </w:tc>
+        <w:tc>
+          <w:tcPr>
+            <w:tcW w:type="dxa" w:w="1134"/>
+            <w:shd w:val="clear" w:color="auto" w:fill="E6EEF8"/>
+          </w:tcPr>
+          <w:p>
+            <w:r/>
+            <w:r>
+              <w:rPr>
+                <w:sz w:val="18"/>
+              </w:rPr>
+              <w:t>OPTIONAL</w:t>
+            </w:r>
+          </w:p>
+        </w:tc>
+        <w:tc>
+          <w:tcPr>
+            <w:tcW w:type="dxa" w:w="2041"/>
+          </w:tcPr>
+          <w:p>
+            <w:r/>
+            <w:r>
+              <w:rPr>
+                <w:color w:val="808080"/>
+                <w:sz w:val="18"/>
+              </w:rPr>
+              <w:t>voice_dream_mom3_b</w:t>
+            </w:r>
+          </w:p>
+        </w:tc>
+        <w:tc>
+          <w:tcPr>
+            <w:tcW w:type="dxa" w:w="1814"/>
+          </w:tcPr>
+          <w:p>
+            <w:r/>
+            <w:r>
+              <w:rPr>
+                <w:sz w:val="18"/>
+              </w:rPr>
+            </w:r>
+          </w:p>
+        </w:tc>
+      </w:tr>
+      <w:tr>
+        <w:tc>
+          <w:tcPr>
+            <w:tcW w:type="dxa" w:w="1134"/>
+          </w:tcPr>
+          <w:p>
+            <w:r/>
+            <w:r>
+              <w:rPr>
+                <w:b/>
+                <w:sz w:val="20"/>
+              </w:rPr>
+              <w:t>audio73</w:t>
+            </w:r>
+          </w:p>
+        </w:tc>
+        <w:tc>
+          <w:tcPr>
+            <w:tcW w:type="dxa" w:w="3061"/>
+          </w:tcPr>
+          <w:p>
+            <w:r/>
+            <w:r>
+              <w:rPr>
+                <w:sz w:val="18"/>
+              </w:rPr>
+              <w:t>Dream, night 3 (Mom)</w:t>
+            </w:r>
+          </w:p>
+        </w:tc>
+        <w:tc>
+          <w:tcPr>
+            <w:tcW w:type="dxa" w:w="4649"/>
+          </w:tcPr>
+          <w:p>
+            <w:r/>
+            <w:r>
+              <w:rPr>
+                <w:sz w:val="18"/>
+              </w:rPr>
+              <w:t>Mom, a whisper: "...I know."</w:t>
+            </w:r>
+          </w:p>
+        </w:tc>
+        <w:tc>
+          <w:tcPr>
+            <w:tcW w:type="dxa" w:w="1247"/>
+          </w:tcPr>
+          <w:p>
+            <w:r/>
+            <w:r>
+              <w:rPr>
+                <w:sz w:val="18"/>
+              </w:rPr>
+              <w:t>2 s</w:t>
+            </w:r>
+          </w:p>
+        </w:tc>
+        <w:tc>
+          <w:tcPr>
+            <w:tcW w:type="dxa" w:w="1134"/>
+            <w:shd w:val="clear" w:color="auto" w:fill="E6EEF8"/>
+          </w:tcPr>
+          <w:p>
+            <w:r/>
+            <w:r>
+              <w:rPr>
+                <w:sz w:val="18"/>
+              </w:rPr>
+              <w:t>OPTIONAL</w:t>
+            </w:r>
+          </w:p>
+        </w:tc>
+        <w:tc>
+          <w:tcPr>
+            <w:tcW w:type="dxa" w:w="2041"/>
+          </w:tcPr>
+          <w:p>
+            <w:r/>
+            <w:r>
+              <w:rPr>
+                <w:color w:val="808080"/>
+                <w:sz w:val="18"/>
+              </w:rPr>
+              <w:t>voice_dream_mom3_c</w:t>
+            </w:r>
+          </w:p>
+        </w:tc>
+        <w:tc>
+          <w:tcPr>
+            <w:tcW w:type="dxa" w:w="1814"/>
+          </w:tcPr>
+          <w:p>
+            <w:r/>
+            <w:r>
+              <w:rPr>
+                <w:sz w:val="18"/>
+              </w:rPr>
+            </w:r>
+          </w:p>
+        </w:tc>
+      </w:tr>
+      <w:tr>
+        <w:tc>
+          <w:tcPr>
+            <w:tcW w:type="dxa" w:w="1134"/>
+          </w:tcPr>
+          <w:p>
+            <w:r/>
+            <w:r>
+              <w:rPr>
+                <w:b/>
+                <w:sz w:val="20"/>
+              </w:rPr>
+              <w:t>audio74</w:t>
+            </w:r>
+          </w:p>
+        </w:tc>
+        <w:tc>
+          <w:tcPr>
+            <w:tcW w:type="dxa" w:w="3061"/>
+          </w:tcPr>
+          <w:p>
+            <w:r/>
+            <w:r>
+              <w:rPr>
+                <w:sz w:val="18"/>
+              </w:rPr>
+              <w:t>Dream, night 1 (Luna): stars over her bed</w:t>
+            </w:r>
+          </w:p>
+        </w:tc>
+        <w:tc>
+          <w:tcPr>
+            <w:tcW w:type="dxa" w:w="4649"/>
+          </w:tcPr>
+          <w:p>
+            <w:r/>
+            <w:r>
+              <w:rPr>
+                <w:sz w:val="18"/>
+              </w:rPr>
+              <w:t>Father, very soft: "Every star up there is a night I’ll watch over you."</w:t>
+            </w:r>
+          </w:p>
+        </w:tc>
+        <w:tc>
+          <w:tcPr>
+            <w:tcW w:type="dxa" w:w="1247"/>
+          </w:tcPr>
+          <w:p>
+            <w:r/>
+            <w:r>
+              <w:rPr>
+                <w:sz w:val="18"/>
+              </w:rPr>
+              <w:t>4 s</w:t>
+            </w:r>
+          </w:p>
+        </w:tc>
+        <w:tc>
+          <w:tcPr>
+            <w:tcW w:type="dxa" w:w="1134"/>
+            <w:shd w:val="clear" w:color="auto" w:fill="E6EEF8"/>
+          </w:tcPr>
+          <w:p>
+            <w:r/>
+            <w:r>
+              <w:rPr>
+                <w:sz w:val="18"/>
+              </w:rPr>
+              <w:t>OPTIONAL</w:t>
+            </w:r>
+          </w:p>
+        </w:tc>
+        <w:tc>
+          <w:tcPr>
+            <w:tcW w:type="dxa" w:w="2041"/>
+          </w:tcPr>
+          <w:p>
+            <w:r/>
+            <w:r>
+              <w:rPr>
+                <w:color w:val="808080"/>
+                <w:sz w:val="18"/>
+              </w:rPr>
+              <w:t>voice_dream_luna1_a</w:t>
+            </w:r>
+          </w:p>
+        </w:tc>
+        <w:tc>
+          <w:tcPr>
+            <w:tcW w:type="dxa" w:w="1814"/>
+          </w:tcPr>
+          <w:p>
+            <w:r/>
+            <w:r>
+              <w:rPr>
+                <w:sz w:val="18"/>
+              </w:rPr>
+            </w:r>
+          </w:p>
+        </w:tc>
+      </w:tr>
+      <w:tr>
+        <w:tc>
+          <w:tcPr>
+            <w:tcW w:type="dxa" w:w="1134"/>
+          </w:tcPr>
+          <w:p>
+            <w:r/>
+            <w:r>
+              <w:rPr>
+                <w:b/>
+                <w:sz w:val="20"/>
+              </w:rPr>
+              <w:t>audio75</w:t>
+            </w:r>
+          </w:p>
+        </w:tc>
+        <w:tc>
+          <w:tcPr>
+            <w:tcW w:type="dxa" w:w="3061"/>
+          </w:tcPr>
+          <w:p>
+            <w:r/>
+            <w:r>
+              <w:rPr>
+                <w:sz w:val="18"/>
+              </w:rPr>
+              <w:t>Dream, night 2 (Luna): first steps</w:t>
+            </w:r>
+          </w:p>
+        </w:tc>
+        <w:tc>
+          <w:tcPr>
+            <w:tcW w:type="dxa" w:w="4649"/>
+          </w:tcPr>
+          <w:p>
+            <w:r/>
+            <w:r>
+              <w:rPr>
+                <w:sz w:val="18"/>
+              </w:rPr>
+              <w:t>Father, encouraging: "Come here... that’s it."</w:t>
+            </w:r>
+          </w:p>
+        </w:tc>
+        <w:tc>
+          <w:tcPr>
+            <w:tcW w:type="dxa" w:w="1247"/>
+          </w:tcPr>
+          <w:p>
+            <w:r/>
+            <w:r>
+              <w:rPr>
+                <w:sz w:val="18"/>
+              </w:rPr>
+              <w:t>3 s</w:t>
+            </w:r>
+          </w:p>
+        </w:tc>
+        <w:tc>
+          <w:tcPr>
+            <w:tcW w:type="dxa" w:w="1134"/>
+            <w:shd w:val="clear" w:color="auto" w:fill="E6EEF8"/>
+          </w:tcPr>
+          <w:p>
+            <w:r/>
+            <w:r>
+              <w:rPr>
+                <w:sz w:val="18"/>
+              </w:rPr>
+              <w:t>OPTIONAL</w:t>
+            </w:r>
+          </w:p>
+        </w:tc>
+        <w:tc>
+          <w:tcPr>
+            <w:tcW w:type="dxa" w:w="2041"/>
+          </w:tcPr>
+          <w:p>
+            <w:r/>
+            <w:r>
+              <w:rPr>
+                <w:color w:val="808080"/>
+                <w:sz w:val="18"/>
+              </w:rPr>
+              <w:t>voice_dream_luna2_a</w:t>
+            </w:r>
+          </w:p>
+        </w:tc>
+        <w:tc>
+          <w:tcPr>
+            <w:tcW w:type="dxa" w:w="1814"/>
+          </w:tcPr>
+          <w:p>
+            <w:r/>
+            <w:r>
+              <w:rPr>
+                <w:sz w:val="18"/>
+              </w:rPr>
+            </w:r>
+          </w:p>
+        </w:tc>
+      </w:tr>
+      <w:tr>
+        <w:tc>
+          <w:tcPr>
+            <w:tcW w:type="dxa" w:w="1134"/>
+          </w:tcPr>
+          <w:p>
+            <w:r/>
+            <w:r>
+              <w:rPr>
+                <w:b/>
+                <w:sz w:val="20"/>
+              </w:rPr>
+              <w:t>audio76</w:t>
+            </w:r>
+          </w:p>
+        </w:tc>
+        <w:tc>
+          <w:tcPr>
+            <w:tcW w:type="dxa" w:w="3061"/>
+          </w:tcPr>
+          <w:p>
+            <w:r/>
+            <w:r>
+              <w:rPr>
+                <w:sz w:val="18"/>
+              </w:rPr>
+              <w:t>Dream, night 2 (Luna)</w:t>
+            </w:r>
+          </w:p>
+        </w:tc>
+        <w:tc>
+          <w:tcPr>
+            <w:tcW w:type="dxa" w:w="4649"/>
+          </w:tcPr>
+          <w:p>
+            <w:r/>
+            <w:r>
+              <w:rPr>
+                <w:sz w:val="18"/>
+              </w:rPr>
+              <w:t>Father, proud: "That’s my girl."</w:t>
+            </w:r>
+          </w:p>
+        </w:tc>
+        <w:tc>
+          <w:tcPr>
+            <w:tcW w:type="dxa" w:w="1247"/>
+          </w:tcPr>
+          <w:p>
+            <w:r/>
+            <w:r>
+              <w:rPr>
+                <w:sz w:val="18"/>
+              </w:rPr>
+              <w:t>2 s</w:t>
+            </w:r>
+          </w:p>
+        </w:tc>
+        <w:tc>
+          <w:tcPr>
+            <w:tcW w:type="dxa" w:w="1134"/>
+            <w:shd w:val="clear" w:color="auto" w:fill="E6EEF8"/>
+          </w:tcPr>
+          <w:p>
+            <w:r/>
+            <w:r>
+              <w:rPr>
+                <w:sz w:val="18"/>
+              </w:rPr>
+              <w:t>OPTIONAL</w:t>
+            </w:r>
+          </w:p>
+        </w:tc>
+        <w:tc>
+          <w:tcPr>
+            <w:tcW w:type="dxa" w:w="2041"/>
+          </w:tcPr>
+          <w:p>
+            <w:r/>
+            <w:r>
+              <w:rPr>
+                <w:color w:val="808080"/>
+                <w:sz w:val="18"/>
+              </w:rPr>
+              <w:t>voice_dream_luna2_b</w:t>
+            </w:r>
+          </w:p>
+        </w:tc>
+        <w:tc>
+          <w:tcPr>
+            <w:tcW w:type="dxa" w:w="1814"/>
+          </w:tcPr>
+          <w:p>
+            <w:r/>
+            <w:r>
+              <w:rPr>
+                <w:sz w:val="18"/>
+              </w:rPr>
+            </w:r>
+          </w:p>
+        </w:tc>
+      </w:tr>
+      <w:tr>
+        <w:tc>
+          <w:tcPr>
+            <w:tcW w:type="dxa" w:w="1134"/>
+          </w:tcPr>
+          <w:p>
+            <w:r/>
+            <w:r>
+              <w:rPr>
+                <w:b/>
+                <w:sz w:val="20"/>
+              </w:rPr>
+              <w:t>audio77</w:t>
+            </w:r>
+          </w:p>
+        </w:tc>
+        <w:tc>
+          <w:tcPr>
+            <w:tcW w:type="dxa" w:w="3061"/>
+          </w:tcPr>
+          <w:p>
+            <w:r/>
+            <w:r>
+              <w:rPr>
+                <w:sz w:val="18"/>
+              </w:rPr>
+              <w:t>Dream, night 3 (Luna): the candle</w:t>
+            </w:r>
+          </w:p>
+        </w:tc>
+        <w:tc>
+          <w:tcPr>
+            <w:tcW w:type="dxa" w:w="4649"/>
+          </w:tcPr>
+          <w:p>
+            <w:r/>
+            <w:r>
+              <w:rPr>
+                <w:sz w:val="18"/>
+              </w:rPr>
+              <w:t>Father: "You won’t remember me, little one."</w:t>
+            </w:r>
+          </w:p>
+        </w:tc>
+        <w:tc>
+          <w:tcPr>
+            <w:tcW w:type="dxa" w:w="1247"/>
+          </w:tcPr>
+          <w:p>
+            <w:r/>
+            <w:r>
+              <w:rPr>
+                <w:sz w:val="18"/>
+              </w:rPr>
+              <w:t>3 s</w:t>
+            </w:r>
+          </w:p>
+        </w:tc>
+        <w:tc>
+          <w:tcPr>
+            <w:tcW w:type="dxa" w:w="1134"/>
+            <w:shd w:val="clear" w:color="auto" w:fill="E6EEF8"/>
+          </w:tcPr>
+          <w:p>
+            <w:r/>
+            <w:r>
+              <w:rPr>
+                <w:sz w:val="18"/>
+              </w:rPr>
+              <w:t>OPTIONAL</w:t>
+            </w:r>
+          </w:p>
+        </w:tc>
+        <w:tc>
+          <w:tcPr>
+            <w:tcW w:type="dxa" w:w="2041"/>
+          </w:tcPr>
+          <w:p>
+            <w:r/>
+            <w:r>
+              <w:rPr>
+                <w:color w:val="808080"/>
+                <w:sz w:val="18"/>
+              </w:rPr>
+              <w:t>voice_dream_luna3_a</w:t>
+            </w:r>
+          </w:p>
+        </w:tc>
+        <w:tc>
+          <w:tcPr>
+            <w:tcW w:type="dxa" w:w="1814"/>
+          </w:tcPr>
+          <w:p>
+            <w:r/>
+            <w:r>
+              <w:rPr>
+                <w:sz w:val="18"/>
+              </w:rPr>
+            </w:r>
+          </w:p>
+        </w:tc>
+      </w:tr>
+      <w:tr>
+        <w:tc>
+          <w:tcPr>
+            <w:tcW w:type="dxa" w:w="1134"/>
+          </w:tcPr>
+          <w:p>
+            <w:r/>
+            <w:r>
+              <w:rPr>
+                <w:b/>
+                <w:sz w:val="20"/>
+              </w:rPr>
+              <w:t>audio78</w:t>
+            </w:r>
+          </w:p>
+        </w:tc>
+        <w:tc>
+          <w:tcPr>
+            <w:tcW w:type="dxa" w:w="3061"/>
+          </w:tcPr>
+          <w:p>
+            <w:r/>
+            <w:r>
+              <w:rPr>
+                <w:sz w:val="18"/>
+              </w:rPr>
+              <w:t>Dream, night 3 (Luna)</w:t>
+            </w:r>
+          </w:p>
+        </w:tc>
+        <w:tc>
+          <w:tcPr>
+            <w:tcW w:type="dxa" w:w="4649"/>
+          </w:tcPr>
+          <w:p>
+            <w:r/>
+            <w:r>
+              <w:rPr>
+                <w:sz w:val="18"/>
+              </w:rPr>
+              <w:t>Father: "That’s all right. I’ll remember for both of us."</w:t>
+            </w:r>
+          </w:p>
+        </w:tc>
+        <w:tc>
+          <w:tcPr>
+            <w:tcW w:type="dxa" w:w="1247"/>
+          </w:tcPr>
+          <w:p>
+            <w:r/>
+            <w:r>
+              <w:rPr>
+                <w:sz w:val="18"/>
+              </w:rPr>
+              <w:t>4 s</w:t>
+            </w:r>
+          </w:p>
+        </w:tc>
+        <w:tc>
+          <w:tcPr>
+            <w:tcW w:type="dxa" w:w="1134"/>
+            <w:shd w:val="clear" w:color="auto" w:fill="E6EEF8"/>
+          </w:tcPr>
+          <w:p>
+            <w:r/>
+            <w:r>
+              <w:rPr>
+                <w:sz w:val="18"/>
+              </w:rPr>
+              <w:t>OPTIONAL</w:t>
+            </w:r>
+          </w:p>
+        </w:tc>
+        <w:tc>
+          <w:tcPr>
+            <w:tcW w:type="dxa" w:w="2041"/>
+          </w:tcPr>
+          <w:p>
+            <w:r/>
+            <w:r>
+              <w:rPr>
+                <w:color w:val="808080"/>
+                <w:sz w:val="18"/>
+              </w:rPr>
+              <w:t>voice_dream_luna3_b</w:t>
+            </w:r>
+          </w:p>
+        </w:tc>
+        <w:tc>
+          <w:tcPr>
+            <w:tcW w:type="dxa" w:w="1814"/>
+          </w:tcPr>
+          <w:p>
+            <w:r/>
+            <w:r>
+              <w:rPr>
+                <w:sz w:val="18"/>
+              </w:rPr>
+            </w:r>
+          </w:p>
+        </w:tc>
+      </w:tr>
+      <w:tr>
+        <w:tc>
+          <w:tcPr>
+            <w:tcW w:type="dxa" w:w="1134"/>
+          </w:tcPr>
+          <w:p>
+            <w:r/>
+            <w:r>
+              <w:rPr>
+                <w:b/>
+                <w:sz w:val="20"/>
+              </w:rPr>
+              <w:t>audio79</w:t>
+            </w:r>
+          </w:p>
+        </w:tc>
+        <w:tc>
+          <w:tcPr>
+            <w:tcW w:type="dxa" w:w="3061"/>
+          </w:tcPr>
+          <w:p>
+            <w:r/>
+            <w:r>
+              <w:rPr>
+                <w:sz w:val="18"/>
+              </w:rPr>
+              <w:t>Ending 1 (nobody felt him: they flee)</w:t>
+            </w:r>
+          </w:p>
+        </w:tc>
+        <w:tc>
+          <w:tcPr>
+            <w:tcW w:type="dxa" w:w="4649"/>
+          </w:tcPr>
+          <w:p>
+            <w:r/>
+            <w:r>
+              <w:rPr>
+                <w:sz w:val="18"/>
+              </w:rPr>
+              <w:t>Mom, frightened: "I can’t stay here another night. Something in this house won’t let us rest."</w:t>
+            </w:r>
+          </w:p>
+        </w:tc>
+        <w:tc>
+          <w:tcPr>
+            <w:tcW w:type="dxa" w:w="1247"/>
+          </w:tcPr>
+          <w:p>
+            <w:r/>
+            <w:r>
+              <w:rPr>
+                <w:sz w:val="18"/>
+              </w:rPr>
+              <w:t>5 s</w:t>
+            </w:r>
+          </w:p>
+        </w:tc>
+        <w:tc>
+          <w:tcPr>
+            <w:tcW w:type="dxa" w:w="1134"/>
+            <w:shd w:val="clear" w:color="auto" w:fill="E6EEF8"/>
+          </w:tcPr>
+          <w:p>
+            <w:r/>
+            <w:r>
+              <w:rPr>
+                <w:sz w:val="18"/>
+              </w:rPr>
+              <w:t>OPTIONAL</w:t>
+            </w:r>
+          </w:p>
+        </w:tc>
+        <w:tc>
+          <w:tcPr>
+            <w:tcW w:type="dxa" w:w="2041"/>
+          </w:tcPr>
+          <w:p>
+            <w:r/>
+            <w:r>
+              <w:rPr>
+                <w:color w:val="808080"/>
+                <w:sz w:val="18"/>
+              </w:rPr>
+              <w:t>voice_end1_mom</w:t>
+            </w:r>
+          </w:p>
+        </w:tc>
+        <w:tc>
+          <w:tcPr>
+            <w:tcW w:type="dxa" w:w="1814"/>
+          </w:tcPr>
+          <w:p>
+            <w:r/>
+            <w:r>
+              <w:rPr>
+                <w:sz w:val="18"/>
+              </w:rPr>
+            </w:r>
+          </w:p>
+        </w:tc>
+      </w:tr>
+      <w:tr>
+        <w:tc>
+          <w:tcPr>
+            <w:tcW w:type="dxa" w:w="1134"/>
+          </w:tcPr>
+          <w:p>
+            <w:r/>
+            <w:r>
+              <w:rPr>
+                <w:b/>
+                <w:sz w:val="20"/>
+              </w:rPr>
+              <w:t>audio80</w:t>
+            </w:r>
+          </w:p>
+        </w:tc>
+        <w:tc>
+          <w:tcPr>
+            <w:tcW w:type="dxa" w:w="3061"/>
+          </w:tcPr>
+          <w:p>
+            <w:r/>
+            <w:r>
+              <w:rPr>
+                <w:sz w:val="18"/>
+              </w:rPr>
+              <w:t>Ending 1</w:t>
+            </w:r>
+          </w:p>
+        </w:tc>
+        <w:tc>
+          <w:tcPr>
+            <w:tcW w:type="dxa" w:w="4649"/>
+          </w:tcPr>
+          <w:p>
+            <w:r/>
+            <w:r>
+              <w:rPr>
+                <w:sz w:val="18"/>
+              </w:rPr>
+              <w:t>The ghost, broken: "I only wanted them to know I was here."</w:t>
+            </w:r>
+          </w:p>
+        </w:tc>
+        <w:tc>
+          <w:tcPr>
+            <w:tcW w:type="dxa" w:w="1247"/>
+          </w:tcPr>
+          <w:p>
+            <w:r/>
+            <w:r>
+              <w:rPr>
+                <w:sz w:val="18"/>
+              </w:rPr>
+              <w:t>4 s</w:t>
+            </w:r>
+          </w:p>
+        </w:tc>
+        <w:tc>
+          <w:tcPr>
+            <w:tcW w:type="dxa" w:w="1134"/>
+            <w:shd w:val="clear" w:color="auto" w:fill="E6EEF8"/>
+          </w:tcPr>
+          <w:p>
+            <w:r/>
+            <w:r>
+              <w:rPr>
+                <w:sz w:val="18"/>
+              </w:rPr>
+              <w:t>OPTIONAL</w:t>
+            </w:r>
+          </w:p>
+        </w:tc>
+        <w:tc>
+          <w:tcPr>
+            <w:tcW w:type="dxa" w:w="2041"/>
+          </w:tcPr>
+          <w:p>
+            <w:r/>
+            <w:r>
+              <w:rPr>
+                <w:color w:val="808080"/>
+                <w:sz w:val="18"/>
+              </w:rPr>
+              <w:t>voice_end1_ghost</w:t>
+            </w:r>
+          </w:p>
+        </w:tc>
+        <w:tc>
+          <w:tcPr>
+            <w:tcW w:type="dxa" w:w="1814"/>
+          </w:tcPr>
+          <w:p>
+            <w:r/>
+            <w:r>
+              <w:rPr>
+                <w:sz w:val="18"/>
+              </w:rPr>
+            </w:r>
+          </w:p>
+        </w:tc>
+      </w:tr>
+      <w:tr>
+        <w:tc>
+          <w:tcPr>
+            <w:tcW w:type="dxa" w:w="1134"/>
+          </w:tcPr>
+          <w:p>
+            <w:r/>
+            <w:r>
+              <w:rPr>
+                <w:b/>
+                <w:sz w:val="20"/>
+              </w:rPr>
+              <w:t>audio81</w:t>
+            </w:r>
+          </w:p>
+        </w:tc>
+        <w:tc>
+          <w:tcPr>
+            <w:tcW w:type="dxa" w:w="3061"/>
+          </w:tcPr>
+          <w:p>
+            <w:r/>
+            <w:r>
+              <w:rPr>
+                <w:sz w:val="18"/>
+              </w:rPr>
+              <w:t>Ending 2 (only Mom felt him)</w:t>
+            </w:r>
+          </w:p>
+        </w:tc>
+        <w:tc>
+          <w:tcPr>
+            <w:tcW w:type="dxa" w:w="4649"/>
+          </w:tcPr>
+          <w:p>
+            <w:r/>
+            <w:r>
+              <w:rPr>
+                <w:sz w:val="18"/>
+              </w:rPr>
+              <w:t>Mom, smiling through tears: "I know it’s you. I always knew."</w:t>
+            </w:r>
+          </w:p>
+        </w:tc>
+        <w:tc>
+          <w:tcPr>
+            <w:tcW w:type="dxa" w:w="1247"/>
+          </w:tcPr>
+          <w:p>
+            <w:r/>
+            <w:r>
+              <w:rPr>
+                <w:sz w:val="18"/>
+              </w:rPr>
+              <w:t>4 s</w:t>
+            </w:r>
+          </w:p>
+        </w:tc>
+        <w:tc>
+          <w:tcPr>
+            <w:tcW w:type="dxa" w:w="1134"/>
+            <w:shd w:val="clear" w:color="auto" w:fill="E6EEF8"/>
+          </w:tcPr>
+          <w:p>
+            <w:r/>
+            <w:r>
+              <w:rPr>
+                <w:sz w:val="18"/>
+              </w:rPr>
+              <w:t>OPTIONAL</w:t>
+            </w:r>
+          </w:p>
+        </w:tc>
+        <w:tc>
+          <w:tcPr>
+            <w:tcW w:type="dxa" w:w="2041"/>
+          </w:tcPr>
+          <w:p>
+            <w:r/>
+            <w:r>
+              <w:rPr>
+                <w:color w:val="808080"/>
+                <w:sz w:val="18"/>
+              </w:rPr>
+              <w:t>voice_end2_mom_a</w:t>
+            </w:r>
+          </w:p>
+        </w:tc>
+        <w:tc>
+          <w:tcPr>
+            <w:tcW w:type="dxa" w:w="1814"/>
+          </w:tcPr>
+          <w:p>
+            <w:r/>
+            <w:r>
+              <w:rPr>
+                <w:sz w:val="18"/>
+              </w:rPr>
+            </w:r>
+          </w:p>
+        </w:tc>
+      </w:tr>
+      <w:tr>
+        <w:tc>
+          <w:tcPr>
+            <w:tcW w:type="dxa" w:w="1134"/>
+          </w:tcPr>
+          <w:p>
+            <w:r/>
+            <w:r>
+              <w:rPr>
+                <w:b/>
+                <w:sz w:val="20"/>
+              </w:rPr>
+              <w:t>audio82</w:t>
+            </w:r>
+          </w:p>
+        </w:tc>
+        <w:tc>
+          <w:tcPr>
+            <w:tcW w:type="dxa" w:w="3061"/>
+          </w:tcPr>
+          <w:p>
+            <w:r/>
+            <w:r>
+              <w:rPr>
+                <w:sz w:val="18"/>
+              </w:rPr>
+              <w:t>Ending 2</w:t>
+            </w:r>
+          </w:p>
+        </w:tc>
+        <w:tc>
+          <w:tcPr>
+            <w:tcW w:type="dxa" w:w="4649"/>
+          </w:tcPr>
+          <w:p>
+            <w:r/>
+            <w:r>
+              <w:rPr>
+                <w:sz w:val="18"/>
+              </w:rPr>
+              <w:t>Mom: "Thank you for staying with us. You can rest now."</w:t>
+            </w:r>
+          </w:p>
+        </w:tc>
+        <w:tc>
+          <w:tcPr>
+            <w:tcW w:type="dxa" w:w="1247"/>
+          </w:tcPr>
+          <w:p>
+            <w:r/>
+            <w:r>
+              <w:rPr>
+                <w:sz w:val="18"/>
+              </w:rPr>
+              <w:t>4 s</w:t>
+            </w:r>
+          </w:p>
+        </w:tc>
+        <w:tc>
+          <w:tcPr>
+            <w:tcW w:type="dxa" w:w="1134"/>
+            <w:shd w:val="clear" w:color="auto" w:fill="E6EEF8"/>
+          </w:tcPr>
+          <w:p>
+            <w:r/>
+            <w:r>
+              <w:rPr>
+                <w:sz w:val="18"/>
+              </w:rPr>
+              <w:t>OPTIONAL</w:t>
+            </w:r>
+          </w:p>
+        </w:tc>
+        <w:tc>
+          <w:tcPr>
+            <w:tcW w:type="dxa" w:w="2041"/>
+          </w:tcPr>
+          <w:p>
+            <w:r/>
+            <w:r>
+              <w:rPr>
+                <w:color w:val="808080"/>
+                <w:sz w:val="18"/>
+              </w:rPr>
+              <w:t>voice_end2_mom_b</w:t>
+            </w:r>
+          </w:p>
+        </w:tc>
+        <w:tc>
+          <w:tcPr>
+            <w:tcW w:type="dxa" w:w="1814"/>
+          </w:tcPr>
+          <w:p>
+            <w:r/>
+            <w:r>
+              <w:rPr>
+                <w:sz w:val="18"/>
+              </w:rPr>
+            </w:r>
+          </w:p>
+        </w:tc>
+      </w:tr>
+      <w:tr>
+        <w:tc>
+          <w:tcPr>
+            <w:tcW w:type="dxa" w:w="1134"/>
+          </w:tcPr>
+          <w:p>
+            <w:r/>
+            <w:r>
+              <w:rPr>
+                <w:b/>
+                <w:sz w:val="20"/>
+              </w:rPr>
+              <w:t>audio83</w:t>
+            </w:r>
+          </w:p>
+        </w:tc>
+        <w:tc>
+          <w:tcPr>
+            <w:tcW w:type="dxa" w:w="3061"/>
+          </w:tcPr>
+          <w:p>
+            <w:r/>
+            <w:r>
+              <w:rPr>
+                <w:sz w:val="18"/>
+              </w:rPr>
+              <w:t>Ending 3 (only Luna felt him)</w:t>
+            </w:r>
+          </w:p>
+        </w:tc>
+        <w:tc>
+          <w:tcPr>
+            <w:tcW w:type="dxa" w:w="4649"/>
+          </w:tcPr>
+          <w:p>
+            <w:r/>
+            <w:r>
+              <w:rPr>
+                <w:sz w:val="18"/>
+              </w:rPr>
+              <w:t>Mom, puzzled: "Who are you smiling at, Luna?"</w:t>
+            </w:r>
+          </w:p>
+        </w:tc>
+        <w:tc>
+          <w:tcPr>
+            <w:tcW w:type="dxa" w:w="1247"/>
+          </w:tcPr>
+          <w:p>
+            <w:r/>
+            <w:r>
+              <w:rPr>
+                <w:sz w:val="18"/>
+              </w:rPr>
+              <w:t>3 s</w:t>
+            </w:r>
+          </w:p>
+        </w:tc>
+        <w:tc>
+          <w:tcPr>
+            <w:tcW w:type="dxa" w:w="1134"/>
+            <w:shd w:val="clear" w:color="auto" w:fill="E6EEF8"/>
+          </w:tcPr>
+          <w:p>
+            <w:r/>
+            <w:r>
+              <w:rPr>
+                <w:sz w:val="18"/>
+              </w:rPr>
+              <w:t>OPTIONAL</w:t>
+            </w:r>
+          </w:p>
+        </w:tc>
+        <w:tc>
+          <w:tcPr>
+            <w:tcW w:type="dxa" w:w="2041"/>
+          </w:tcPr>
+          <w:p>
+            <w:r/>
+            <w:r>
+              <w:rPr>
+                <w:color w:val="808080"/>
+                <w:sz w:val="18"/>
+              </w:rPr>
+              <w:t>voice_end3_mom</w:t>
+            </w:r>
+          </w:p>
+        </w:tc>
+        <w:tc>
+          <w:tcPr>
+            <w:tcW w:type="dxa" w:w="1814"/>
+          </w:tcPr>
+          <w:p>
+            <w:r/>
+            <w:r>
+              <w:rPr>
+                <w:sz w:val="18"/>
+              </w:rPr>
+            </w:r>
+          </w:p>
+        </w:tc>
+      </w:tr>
+      <w:tr>
+        <w:tc>
+          <w:tcPr>
+            <w:tcW w:type="dxa" w:w="1134"/>
+          </w:tcPr>
+          <w:p>
+            <w:r/>
+            <w:r>
+              <w:rPr>
+                <w:b/>
+                <w:sz w:val="20"/>
+              </w:rPr>
+              <w:t>audio84</w:t>
+            </w:r>
+          </w:p>
+        </w:tc>
+        <w:tc>
+          <w:tcPr>
+            <w:tcW w:type="dxa" w:w="3061"/>
+          </w:tcPr>
+          <w:p>
+            <w:r/>
+            <w:r>
+              <w:rPr>
+                <w:sz w:val="18"/>
+              </w:rPr>
+              <w:t>Ending 3</w:t>
+            </w:r>
+          </w:p>
+        </w:tc>
+        <w:tc>
+          <w:tcPr>
+            <w:tcW w:type="dxa" w:w="4649"/>
+          </w:tcPr>
+          <w:p>
+            <w:r/>
+            <w:r>
+              <w:rPr>
+                <w:sz w:val="18"/>
+              </w:rPr>
+              <w:t>The ghost, gentle: "She will not remember me. But she knew I was here."</w:t>
+            </w:r>
+          </w:p>
+        </w:tc>
+        <w:tc>
+          <w:tcPr>
+            <w:tcW w:type="dxa" w:w="1247"/>
+          </w:tcPr>
+          <w:p>
+            <w:r/>
+            <w:r>
+              <w:rPr>
+                <w:sz w:val="18"/>
+              </w:rPr>
+              <w:t>4 s</w:t>
+            </w:r>
+          </w:p>
+        </w:tc>
+        <w:tc>
+          <w:tcPr>
+            <w:tcW w:type="dxa" w:w="1134"/>
+            <w:shd w:val="clear" w:color="auto" w:fill="E6EEF8"/>
+          </w:tcPr>
+          <w:p>
+            <w:r/>
+            <w:r>
+              <w:rPr>
+                <w:sz w:val="18"/>
+              </w:rPr>
+              <w:t>OPTIONAL</w:t>
+            </w:r>
+          </w:p>
+        </w:tc>
+        <w:tc>
+          <w:tcPr>
+            <w:tcW w:type="dxa" w:w="2041"/>
+          </w:tcPr>
+          <w:p>
+            <w:r/>
+            <w:r>
+              <w:rPr>
+                <w:color w:val="808080"/>
+                <w:sz w:val="18"/>
+              </w:rPr>
+              <w:t>voice_end3_ghost</w:t>
+            </w:r>
+          </w:p>
+        </w:tc>
+        <w:tc>
+          <w:tcPr>
+            <w:tcW w:type="dxa" w:w="1814"/>
+          </w:tcPr>
+          <w:p>
+            <w:r/>
+            <w:r>
+              <w:rPr>
+                <w:sz w:val="18"/>
+              </w:rPr>
+            </w:r>
+          </w:p>
+        </w:tc>
+      </w:tr>
+      <w:tr>
+        <w:tc>
+          <w:tcPr>
+            <w:tcW w:type="dxa" w:w="1134"/>
+          </w:tcPr>
+          <w:p>
+            <w:r/>
+            <w:r>
+              <w:rPr>
+                <w:b/>
+                <w:sz w:val="20"/>
+              </w:rPr>
+              <w:t>audio85</w:t>
+            </w:r>
+          </w:p>
+        </w:tc>
+        <w:tc>
+          <w:tcPr>
+            <w:tcW w:type="dxa" w:w="3061"/>
+          </w:tcPr>
+          <w:p>
+            <w:r/>
+            <w:r>
+              <w:rPr>
+                <w:sz w:val="18"/>
+              </w:rPr>
+              <w:t>Ending 4 (both felt him)</w:t>
+            </w:r>
+          </w:p>
+        </w:tc>
+        <w:tc>
+          <w:tcPr>
+            <w:tcW w:type="dxa" w:w="4649"/>
+          </w:tcPr>
+          <w:p>
+            <w:r/>
+            <w:r>
+              <w:rPr>
+                <w:sz w:val="18"/>
+              </w:rPr>
+              <w:t>Mom, calm and warm: "We’ll be okay. Both of us."</w:t>
+            </w:r>
+          </w:p>
+        </w:tc>
+        <w:tc>
+          <w:tcPr>
+            <w:tcW w:type="dxa" w:w="1247"/>
+          </w:tcPr>
+          <w:p>
+            <w:r/>
+            <w:r>
+              <w:rPr>
+                <w:sz w:val="18"/>
+              </w:rPr>
+              <w:t>3 s</w:t>
+            </w:r>
+          </w:p>
+        </w:tc>
+        <w:tc>
+          <w:tcPr>
+            <w:tcW w:type="dxa" w:w="1134"/>
+            <w:shd w:val="clear" w:color="auto" w:fill="E6EEF8"/>
+          </w:tcPr>
+          <w:p>
+            <w:r/>
+            <w:r>
+              <w:rPr>
+                <w:sz w:val="18"/>
+              </w:rPr>
+              <w:t>OPTIONAL</w:t>
+            </w:r>
+          </w:p>
+        </w:tc>
+        <w:tc>
+          <w:tcPr>
+            <w:tcW w:type="dxa" w:w="2041"/>
+          </w:tcPr>
+          <w:p>
+            <w:r/>
+            <w:r>
+              <w:rPr>
+                <w:color w:val="808080"/>
+                <w:sz w:val="18"/>
+              </w:rPr>
+              <w:t>voice_end4_mom_a</w:t>
+            </w:r>
+          </w:p>
+        </w:tc>
+        <w:tc>
+          <w:tcPr>
+            <w:tcW w:type="dxa" w:w="1814"/>
+          </w:tcPr>
+          <w:p>
+            <w:r/>
+            <w:r>
+              <w:rPr>
+                <w:sz w:val="18"/>
+              </w:rPr>
+            </w:r>
+          </w:p>
+        </w:tc>
+      </w:tr>
+      <w:tr>
+        <w:tc>
+          <w:tcPr>
+            <w:tcW w:type="dxa" w:w="1134"/>
+          </w:tcPr>
+          <w:p>
+            <w:r/>
+            <w:r>
+              <w:rPr>
+                <w:b/>
+                <w:sz w:val="20"/>
+              </w:rPr>
+              <w:t>audio86</w:t>
+            </w:r>
+          </w:p>
+        </w:tc>
+        <w:tc>
+          <w:tcPr>
+            <w:tcW w:type="dxa" w:w="3061"/>
+          </w:tcPr>
+          <w:p>
+            <w:r/>
+            <w:r>
+              <w:rPr>
+                <w:sz w:val="18"/>
+              </w:rPr>
+              <w:t>Ending 4</w:t>
+            </w:r>
+          </w:p>
+        </w:tc>
+        <w:tc>
+          <w:tcPr>
+            <w:tcW w:type="dxa" w:w="4649"/>
+          </w:tcPr>
+          <w:p>
+            <w:r/>
+            <w:r>
+              <w:rPr>
+                <w:sz w:val="18"/>
+              </w:rPr>
+              <w:t>Mom, letting go: "Go home, love."</w:t>
+            </w:r>
+          </w:p>
+        </w:tc>
+        <w:tc>
+          <w:tcPr>
+            <w:tcW w:type="dxa" w:w="1247"/>
+          </w:tcPr>
+          <w:p>
+            <w:r/>
+            <w:r>
+              <w:rPr>
+                <w:sz w:val="18"/>
+              </w:rPr>
+              <w:t>2 s</w:t>
+            </w:r>
+          </w:p>
+        </w:tc>
+        <w:tc>
+          <w:tcPr>
+            <w:tcW w:type="dxa" w:w="1134"/>
+            <w:shd w:val="clear" w:color="auto" w:fill="E6EEF8"/>
+          </w:tcPr>
+          <w:p>
+            <w:r/>
+            <w:r>
+              <w:rPr>
+                <w:sz w:val="18"/>
+              </w:rPr>
+              <w:t>OPTIONAL</w:t>
+            </w:r>
+          </w:p>
+        </w:tc>
+        <w:tc>
+          <w:tcPr>
+            <w:tcW w:type="dxa" w:w="2041"/>
+          </w:tcPr>
+          <w:p>
+            <w:r/>
+            <w:r>
+              <w:rPr>
+                <w:color w:val="808080"/>
+                <w:sz w:val="18"/>
+              </w:rPr>
+              <w:t>voice_end4_mom_b</w:t>
+            </w:r>
+          </w:p>
+        </w:tc>
+        <w:tc>
+          <w:tcPr>
+            <w:tcW w:type="dxa" w:w="1814"/>
+          </w:tcPr>
+          <w:p>
+            <w:r/>
+            <w:r>
+              <w:rPr>
+                <w:sz w:val="18"/>
+              </w:rPr>
+            </w:r>
+          </w:p>
+        </w:tc>
+      </w:tr>
+      <w:tr>
+        <w:tc>
+          <w:tcPr>
+            <w:tcW w:type="dxa" w:w="1134"/>
+          </w:tcPr>
+          <w:p>
+            <w:r/>
+            <w:r>
+              <w:rPr>
+                <w:b/>
+                <w:sz w:val="20"/>
+              </w:rPr>
+              <w:t>audio87</w:t>
+            </w:r>
+          </w:p>
+        </w:tc>
+        <w:tc>
+          <w:tcPr>
+            <w:tcW w:type="dxa" w:w="3061"/>
+          </w:tcPr>
+          <w:p>
+            <w:r/>
+            <w:r>
+              <w:rPr>
+                <w:sz w:val="18"/>
+              </w:rPr>
+              <w:t>Ending 4</w:t>
+            </w:r>
+          </w:p>
+        </w:tc>
+        <w:tc>
+          <w:tcPr>
+            <w:tcW w:type="dxa" w:w="4649"/>
+          </w:tcPr>
+          <w:p>
+            <w:r/>
+            <w:r>
+              <w:rPr>
+                <w:sz w:val="18"/>
+              </w:rPr>
+              <w:t>The ghost, at peace: "I’m home."</w:t>
+            </w:r>
+          </w:p>
+        </w:tc>
+        <w:tc>
+          <w:tcPr>
+            <w:tcW w:type="dxa" w:w="1247"/>
+          </w:tcPr>
+          <w:p>
+            <w:r/>
+            <w:r>
+              <w:rPr>
+                <w:sz w:val="18"/>
+              </w:rPr>
+              <w:t>2 s</w:t>
+            </w:r>
+          </w:p>
+        </w:tc>
+        <w:tc>
+          <w:tcPr>
+            <w:tcW w:type="dxa" w:w="1134"/>
+            <w:shd w:val="clear" w:color="auto" w:fill="E6EEF8"/>
+          </w:tcPr>
+          <w:p>
+            <w:r/>
+            <w:r>
+              <w:rPr>
+                <w:sz w:val="18"/>
+              </w:rPr>
+              <w:t>OPTIONAL</w:t>
+            </w:r>
+          </w:p>
+        </w:tc>
+        <w:tc>
+          <w:tcPr>
+            <w:tcW w:type="dxa" w:w="2041"/>
+          </w:tcPr>
+          <w:p>
+            <w:r/>
+            <w:r>
+              <w:rPr>
+                <w:color w:val="808080"/>
+                <w:sz w:val="18"/>
+              </w:rPr>
+              <w:t>voice_end4_ghost</w:t>
             </w:r>
           </w:p>
         </w:tc>
@@ -7048,7 +10211,7 @@
     </w:p>
     <w:p>
       <w:r>
-        <w:t>Total sounds in this list: 59.</w:t>
+        <w:t>Total rows in this list: 87.</w:t>
       </w:r>
     </w:p>
     <w:sectPr>

</xml_diff>

<commit_message>
New assets: yard dressing (playground, gazebo, fountain, trees, fence), rest spots (bench/swing/slide), 12 new clues with Mom lines and Luna reactions, Father model, Mom animations, harder memory lights, longer nights, bigger bars, easier scares, credits
Co-Authored-By: Claude Opus 5.5 <noreply@anthropic.com>
</commit_message>
<xml_diff>
--- a/Fading_Audio_List.docx
+++ b/Fading_Audio_List.docx
@@ -10201,6 +10201,1369 @@
         <w:pStyle w:val="Heading1"/>
       </w:pPr>
       <w:r>
+        <w:t>H. NEW: sounds of the new clues in the house (one short sound each)</w:t>
+      </w:r>
+    </w:p>
+    <w:tbl>
+      <w:tblPr>
+        <w:tblStyle w:val="TableGrid"/>
+        <w:tblW w:type="auto" w:w="0"/>
+        <w:tblLook w:firstColumn="1" w:firstRow="1" w:lastColumn="0" w:lastRow="0" w:noHBand="0" w:noVBand="1" w:val="04A0"/>
+      </w:tblPr>
+      <w:tblGrid>
+        <w:gridCol w:w="2004"/>
+        <w:gridCol w:w="2004"/>
+        <w:gridCol w:w="2004"/>
+        <w:gridCol w:w="2004"/>
+        <w:gridCol w:w="2004"/>
+        <w:gridCol w:w="2004"/>
+        <w:gridCol w:w="2004"/>
+      </w:tblGrid>
+      <w:tr>
+        <w:tc>
+          <w:tcPr>
+            <w:tcW w:type="dxa" w:w="1134"/>
+            <w:shd w:val="clear" w:color="auto" w:fill="D9D9D9"/>
+          </w:tcPr>
+          <w:p>
+            <w:r/>
+            <w:r>
+              <w:rPr>
+                <w:b/>
+                <w:sz w:val="18"/>
+              </w:rPr>
+              <w:t>ID</w:t>
+            </w:r>
+          </w:p>
+        </w:tc>
+        <w:tc>
+          <w:tcPr>
+            <w:tcW w:type="dxa" w:w="3061"/>
+            <w:shd w:val="clear" w:color="auto" w:fill="D9D9D9"/>
+          </w:tcPr>
+          <w:p>
+            <w:r/>
+            <w:r>
+              <w:rPr>
+                <w:b/>
+                <w:sz w:val="18"/>
+              </w:rPr>
+              <w:t>Plays when</w:t>
+            </w:r>
+          </w:p>
+        </w:tc>
+        <w:tc>
+          <w:tcPr>
+            <w:tcW w:type="dxa" w:w="4649"/>
+            <w:shd w:val="clear" w:color="auto" w:fill="D9D9D9"/>
+          </w:tcPr>
+          <w:p>
+            <w:r/>
+            <w:r>
+              <w:rPr>
+                <w:b/>
+                <w:sz w:val="18"/>
+              </w:rPr>
+              <w:t>It should sound like</w:t>
+            </w:r>
+          </w:p>
+        </w:tc>
+        <w:tc>
+          <w:tcPr>
+            <w:tcW w:type="dxa" w:w="1247"/>
+            <w:shd w:val="clear" w:color="auto" w:fill="D9D9D9"/>
+          </w:tcPr>
+          <w:p>
+            <w:r/>
+            <w:r>
+              <w:rPr>
+                <w:b/>
+                <w:sz w:val="18"/>
+              </w:rPr>
+              <w:t>Length</w:t>
+            </w:r>
+          </w:p>
+        </w:tc>
+        <w:tc>
+          <w:tcPr>
+            <w:tcW w:type="dxa" w:w="1134"/>
+            <w:shd w:val="clear" w:color="auto" w:fill="D9D9D9"/>
+          </w:tcPr>
+          <w:p>
+            <w:r/>
+            <w:r>
+              <w:rPr>
+                <w:b/>
+                <w:sz w:val="18"/>
+              </w:rPr>
+              <w:t>Priority</w:t>
+            </w:r>
+          </w:p>
+        </w:tc>
+        <w:tc>
+          <w:tcPr>
+            <w:tcW w:type="dxa" w:w="2041"/>
+            <w:shd w:val="clear" w:color="auto" w:fill="D9D9D9"/>
+          </w:tcPr>
+          <w:p>
+            <w:r/>
+            <w:r>
+              <w:rPr>
+                <w:b/>
+                <w:sz w:val="18"/>
+              </w:rPr>
+              <w:t>Code name (for me)</w:t>
+            </w:r>
+          </w:p>
+        </w:tc>
+        <w:tc>
+          <w:tcPr>
+            <w:tcW w:type="dxa" w:w="1814"/>
+            <w:shd w:val="clear" w:color="auto" w:fill="D9D9D9"/>
+          </w:tcPr>
+          <w:p>
+            <w:r/>
+            <w:r>
+              <w:rPr>
+                <w:b/>
+                <w:sz w:val="18"/>
+              </w:rPr>
+              <w:t>Your notes</w:t>
+            </w:r>
+          </w:p>
+        </w:tc>
+      </w:tr>
+      <w:tr>
+        <w:tc>
+          <w:tcPr>
+            <w:tcW w:type="dxa" w:w="1134"/>
+          </w:tcPr>
+          <w:p>
+            <w:r/>
+            <w:r>
+              <w:rPr>
+                <w:b/>
+                <w:sz w:val="20"/>
+              </w:rPr>
+              <w:t>audio88</w:t>
+            </w:r>
+          </w:p>
+        </w:tc>
+        <w:tc>
+          <w:tcPr>
+            <w:tcW w:type="dxa" w:w="3061"/>
+          </w:tcPr>
+          <w:p>
+            <w:r/>
+            <w:r>
+              <w:rPr>
+                <w:sz w:val="18"/>
+              </w:rPr>
+              <w:t>Mom's cup of tea slides on the kitchen table</w:t>
+            </w:r>
+          </w:p>
+        </w:tc>
+        <w:tc>
+          <w:tcPr>
+            <w:tcW w:type="dxa" w:w="4649"/>
+          </w:tcPr>
+          <w:p>
+            <w:r/>
+            <w:r>
+              <w:rPr>
+                <w:sz w:val="18"/>
+              </w:rPr>
+              <w:t>A teacup clinking on its saucer.</w:t>
+            </w:r>
+          </w:p>
+        </w:tc>
+        <w:tc>
+          <w:tcPr>
+            <w:tcW w:type="dxa" w:w="1247"/>
+          </w:tcPr>
+          <w:p>
+            <w:r/>
+            <w:r>
+              <w:rPr>
+                <w:sz w:val="18"/>
+              </w:rPr>
+              <w:t>0.5 s</w:t>
+            </w:r>
+          </w:p>
+        </w:tc>
+        <w:tc>
+          <w:tcPr>
+            <w:tcW w:type="dxa" w:w="1134"/>
+            <w:shd w:val="clear" w:color="auto" w:fill="FFF3CC"/>
+          </w:tcPr>
+          <w:p>
+            <w:r/>
+            <w:r>
+              <w:rPr>
+                <w:sz w:val="18"/>
+              </w:rPr>
+              <w:t>NICE</w:t>
+            </w:r>
+          </w:p>
+        </w:tc>
+        <w:tc>
+          <w:tcPr>
+            <w:tcW w:type="dxa" w:w="2041"/>
+          </w:tcPr>
+          <w:p>
+            <w:r/>
+            <w:r>
+              <w:rPr>
+                <w:color w:val="808080"/>
+                <w:sz w:val="18"/>
+              </w:rPr>
+              <w:t>tea_clink</w:t>
+            </w:r>
+          </w:p>
+        </w:tc>
+        <w:tc>
+          <w:tcPr>
+            <w:tcW w:type="dxa" w:w="1814"/>
+          </w:tcPr>
+          <w:p>
+            <w:r/>
+            <w:r>
+              <w:rPr>
+                <w:sz w:val="18"/>
+              </w:rPr>
+            </w:r>
+          </w:p>
+        </w:tc>
+      </w:tr>
+      <w:tr>
+        <w:tc>
+          <w:tcPr>
+            <w:tcW w:type="dxa" w:w="1134"/>
+          </w:tcPr>
+          <w:p>
+            <w:r/>
+            <w:r>
+              <w:rPr>
+                <w:b/>
+                <w:sz w:val="20"/>
+              </w:rPr>
+              <w:t>audio89</w:t>
+            </w:r>
+          </w:p>
+        </w:tc>
+        <w:tc>
+          <w:tcPr>
+            <w:tcW w:type="dxa" w:w="3061"/>
+          </w:tcPr>
+          <w:p>
+            <w:r/>
+            <w:r>
+              <w:rPr>
+                <w:sz w:val="18"/>
+              </w:rPr>
+              <w:t>The flowers in the kitchen sway</w:t>
+            </w:r>
+          </w:p>
+        </w:tc>
+        <w:tc>
+          <w:tcPr>
+            <w:tcW w:type="dxa" w:w="4649"/>
+          </w:tcPr>
+          <w:p>
+            <w:r/>
+            <w:r>
+              <w:rPr>
+                <w:sz w:val="18"/>
+              </w:rPr>
+              <w:t>Soft rustle of leaves and petals.</w:t>
+            </w:r>
+          </w:p>
+        </w:tc>
+        <w:tc>
+          <w:tcPr>
+            <w:tcW w:type="dxa" w:w="1247"/>
+          </w:tcPr>
+          <w:p>
+            <w:r/>
+            <w:r>
+              <w:rPr>
+                <w:sz w:val="18"/>
+              </w:rPr>
+              <w:t>1 s</w:t>
+            </w:r>
+          </w:p>
+        </w:tc>
+        <w:tc>
+          <w:tcPr>
+            <w:tcW w:type="dxa" w:w="1134"/>
+            <w:shd w:val="clear" w:color="auto" w:fill="FFF3CC"/>
+          </w:tcPr>
+          <w:p>
+            <w:r/>
+            <w:r>
+              <w:rPr>
+                <w:sz w:val="18"/>
+              </w:rPr>
+              <w:t>NICE</w:t>
+            </w:r>
+          </w:p>
+        </w:tc>
+        <w:tc>
+          <w:tcPr>
+            <w:tcW w:type="dxa" w:w="2041"/>
+          </w:tcPr>
+          <w:p>
+            <w:r/>
+            <w:r>
+              <w:rPr>
+                <w:color w:val="808080"/>
+                <w:sz w:val="18"/>
+              </w:rPr>
+              <w:t>flowers_rustle</w:t>
+            </w:r>
+          </w:p>
+        </w:tc>
+        <w:tc>
+          <w:tcPr>
+            <w:tcW w:type="dxa" w:w="1814"/>
+          </w:tcPr>
+          <w:p>
+            <w:r/>
+            <w:r>
+              <w:rPr>
+                <w:sz w:val="18"/>
+              </w:rPr>
+            </w:r>
+          </w:p>
+        </w:tc>
+      </w:tr>
+      <w:tr>
+        <w:tc>
+          <w:tcPr>
+            <w:tcW w:type="dxa" w:w="1134"/>
+          </w:tcPr>
+          <w:p>
+            <w:r/>
+            <w:r>
+              <w:rPr>
+                <w:b/>
+                <w:sz w:val="20"/>
+              </w:rPr>
+              <w:t>audio90</w:t>
+            </w:r>
+          </w:p>
+        </w:tc>
+        <w:tc>
+          <w:tcPr>
+            <w:tcW w:type="dxa" w:w="3061"/>
+          </w:tcPr>
+          <w:p>
+            <w:r/>
+            <w:r>
+              <w:rPr>
+                <w:sz w:val="18"/>
+              </w:rPr>
+              <w:t>The desk fan in Mom's room turns</w:t>
+            </w:r>
+          </w:p>
+        </w:tc>
+        <w:tc>
+          <w:tcPr>
+            <w:tcW w:type="dxa" w:w="4649"/>
+          </w:tcPr>
+          <w:p>
+            <w:r/>
+            <w:r>
+              <w:rPr>
+                <w:sz w:val="18"/>
+              </w:rPr>
+              <w:t>A small electric fan starting to whir.</w:t>
+            </w:r>
+          </w:p>
+        </w:tc>
+        <w:tc>
+          <w:tcPr>
+            <w:tcW w:type="dxa" w:w="1247"/>
+          </w:tcPr>
+          <w:p>
+            <w:r/>
+            <w:r>
+              <w:rPr>
+                <w:sz w:val="18"/>
+              </w:rPr>
+              <w:t>2 s</w:t>
+            </w:r>
+          </w:p>
+        </w:tc>
+        <w:tc>
+          <w:tcPr>
+            <w:tcW w:type="dxa" w:w="1134"/>
+            <w:shd w:val="clear" w:color="auto" w:fill="FFF3CC"/>
+          </w:tcPr>
+          <w:p>
+            <w:r/>
+            <w:r>
+              <w:rPr>
+                <w:sz w:val="18"/>
+              </w:rPr>
+              <w:t>NICE</w:t>
+            </w:r>
+          </w:p>
+        </w:tc>
+        <w:tc>
+          <w:tcPr>
+            <w:tcW w:type="dxa" w:w="2041"/>
+          </w:tcPr>
+          <w:p>
+            <w:r/>
+            <w:r>
+              <w:rPr>
+                <w:color w:val="808080"/>
+                <w:sz w:val="18"/>
+              </w:rPr>
+              <w:t>fan_whir</w:t>
+            </w:r>
+          </w:p>
+        </w:tc>
+        <w:tc>
+          <w:tcPr>
+            <w:tcW w:type="dxa" w:w="1814"/>
+          </w:tcPr>
+          <w:p>
+            <w:r/>
+            <w:r>
+              <w:rPr>
+                <w:sz w:val="18"/>
+              </w:rPr>
+            </w:r>
+          </w:p>
+        </w:tc>
+      </w:tr>
+      <w:tr>
+        <w:tc>
+          <w:tcPr>
+            <w:tcW w:type="dxa" w:w="1134"/>
+          </w:tcPr>
+          <w:p>
+            <w:r/>
+            <w:r>
+              <w:rPr>
+                <w:b/>
+                <w:sz w:val="20"/>
+              </w:rPr>
+              <w:t>audio91</w:t>
+            </w:r>
+          </w:p>
+        </w:tc>
+        <w:tc>
+          <w:tcPr>
+            <w:tcW w:type="dxa" w:w="3061"/>
+          </w:tcPr>
+          <w:p>
+            <w:r/>
+            <w:r>
+              <w:rPr>
+                <w:sz w:val="18"/>
+              </w:rPr>
+              <w:t>The globe in Mom's room spins</w:t>
+            </w:r>
+          </w:p>
+        </w:tc>
+        <w:tc>
+          <w:tcPr>
+            <w:tcW w:type="dxa" w:w="4649"/>
+          </w:tcPr>
+          <w:p>
+            <w:r/>
+            <w:r>
+              <w:rPr>
+                <w:sz w:val="18"/>
+              </w:rPr>
+              <w:t>A light spinning, rolling sound.</w:t>
+            </w:r>
+          </w:p>
+        </w:tc>
+        <w:tc>
+          <w:tcPr>
+            <w:tcW w:type="dxa" w:w="1247"/>
+          </w:tcPr>
+          <w:p>
+            <w:r/>
+            <w:r>
+              <w:rPr>
+                <w:sz w:val="18"/>
+              </w:rPr>
+              <w:t>1-2 s</w:t>
+            </w:r>
+          </w:p>
+        </w:tc>
+        <w:tc>
+          <w:tcPr>
+            <w:tcW w:type="dxa" w:w="1134"/>
+            <w:shd w:val="clear" w:color="auto" w:fill="FFF3CC"/>
+          </w:tcPr>
+          <w:p>
+            <w:r/>
+            <w:r>
+              <w:rPr>
+                <w:sz w:val="18"/>
+              </w:rPr>
+              <w:t>NICE</w:t>
+            </w:r>
+          </w:p>
+        </w:tc>
+        <w:tc>
+          <w:tcPr>
+            <w:tcW w:type="dxa" w:w="2041"/>
+          </w:tcPr>
+          <w:p>
+            <w:r/>
+            <w:r>
+              <w:rPr>
+                <w:color w:val="808080"/>
+                <w:sz w:val="18"/>
+              </w:rPr>
+              <w:t>globe_spin</w:t>
+            </w:r>
+          </w:p>
+        </w:tc>
+        <w:tc>
+          <w:tcPr>
+            <w:tcW w:type="dxa" w:w="1814"/>
+          </w:tcPr>
+          <w:p>
+            <w:r/>
+            <w:r>
+              <w:rPr>
+                <w:sz w:val="18"/>
+              </w:rPr>
+            </w:r>
+          </w:p>
+        </w:tc>
+      </w:tr>
+      <w:tr>
+        <w:tc>
+          <w:tcPr>
+            <w:tcW w:type="dxa" w:w="1134"/>
+          </w:tcPr>
+          <w:p>
+            <w:r/>
+            <w:r>
+              <w:rPr>
+                <w:b/>
+                <w:sz w:val="20"/>
+              </w:rPr>
+              <w:t>audio92</w:t>
+            </w:r>
+          </w:p>
+        </w:tc>
+        <w:tc>
+          <w:tcPr>
+            <w:tcW w:type="dxa" w:w="3061"/>
+          </w:tcPr>
+          <w:p>
+            <w:r/>
+            <w:r>
+              <w:rPr>
+                <w:sz w:val="18"/>
+              </w:rPr>
+              <w:t>The alarm clock rattles</w:t>
+            </w:r>
+          </w:p>
+        </w:tc>
+        <w:tc>
+          <w:tcPr>
+            <w:tcW w:type="dxa" w:w="4649"/>
+          </w:tcPr>
+          <w:p>
+            <w:r/>
+            <w:r>
+              <w:rPr>
+                <w:sz w:val="18"/>
+              </w:rPr>
+              <w:t>An old wind-up alarm clock ringing briefly.</w:t>
+            </w:r>
+          </w:p>
+        </w:tc>
+        <w:tc>
+          <w:tcPr>
+            <w:tcW w:type="dxa" w:w="1247"/>
+          </w:tcPr>
+          <w:p>
+            <w:r/>
+            <w:r>
+              <w:rPr>
+                <w:sz w:val="18"/>
+              </w:rPr>
+              <w:t>1-2 s</w:t>
+            </w:r>
+          </w:p>
+        </w:tc>
+        <w:tc>
+          <w:tcPr>
+            <w:tcW w:type="dxa" w:w="1134"/>
+            <w:shd w:val="clear" w:color="auto" w:fill="FFF3CC"/>
+          </w:tcPr>
+          <w:p>
+            <w:r/>
+            <w:r>
+              <w:rPr>
+                <w:sz w:val="18"/>
+              </w:rPr>
+              <w:t>NICE</w:t>
+            </w:r>
+          </w:p>
+        </w:tc>
+        <w:tc>
+          <w:tcPr>
+            <w:tcW w:type="dxa" w:w="2041"/>
+          </w:tcPr>
+          <w:p>
+            <w:r/>
+            <w:r>
+              <w:rPr>
+                <w:color w:val="808080"/>
+                <w:sz w:val="18"/>
+              </w:rPr>
+              <w:t>clock_ring</w:t>
+            </w:r>
+          </w:p>
+        </w:tc>
+        <w:tc>
+          <w:tcPr>
+            <w:tcW w:type="dxa" w:w="1814"/>
+          </w:tcPr>
+          <w:p>
+            <w:r/>
+            <w:r>
+              <w:rPr>
+                <w:sz w:val="18"/>
+              </w:rPr>
+            </w:r>
+          </w:p>
+        </w:tc>
+      </w:tr>
+      <w:tr>
+        <w:tc>
+          <w:tcPr>
+            <w:tcW w:type="dxa" w:w="1134"/>
+          </w:tcPr>
+          <w:p>
+            <w:r/>
+            <w:r>
+              <w:rPr>
+                <w:b/>
+                <w:sz w:val="20"/>
+              </w:rPr>
+              <w:t>audio93</w:t>
+            </w:r>
+          </w:p>
+        </w:tc>
+        <w:tc>
+          <w:tcPr>
+            <w:tcW w:type="dxa" w:w="3061"/>
+          </w:tcPr>
+          <w:p>
+            <w:r/>
+            <w:r>
+              <w:rPr>
+                <w:sz w:val="18"/>
+              </w:rPr>
+              <w:t>The living room ceiling fan turns</w:t>
+            </w:r>
+          </w:p>
+        </w:tc>
+        <w:tc>
+          <w:tcPr>
+            <w:tcW w:type="dxa" w:w="4649"/>
+          </w:tcPr>
+          <w:p>
+            <w:r/>
+            <w:r>
+              <w:rPr>
+                <w:sz w:val="18"/>
+              </w:rPr>
+              <w:t>A slow ceiling fan whoosh with a faint tick.</w:t>
+            </w:r>
+          </w:p>
+        </w:tc>
+        <w:tc>
+          <w:tcPr>
+            <w:tcW w:type="dxa" w:w="1247"/>
+          </w:tcPr>
+          <w:p>
+            <w:r/>
+            <w:r>
+              <w:rPr>
+                <w:sz w:val="18"/>
+              </w:rPr>
+              <w:t>2-3 s</w:t>
+            </w:r>
+          </w:p>
+        </w:tc>
+        <w:tc>
+          <w:tcPr>
+            <w:tcW w:type="dxa" w:w="1134"/>
+            <w:shd w:val="clear" w:color="auto" w:fill="FFF3CC"/>
+          </w:tcPr>
+          <w:p>
+            <w:r/>
+            <w:r>
+              <w:rPr>
+                <w:sz w:val="18"/>
+              </w:rPr>
+              <w:t>NICE</w:t>
+            </w:r>
+          </w:p>
+        </w:tc>
+        <w:tc>
+          <w:tcPr>
+            <w:tcW w:type="dxa" w:w="2041"/>
+          </w:tcPr>
+          <w:p>
+            <w:r/>
+            <w:r>
+              <w:rPr>
+                <w:color w:val="808080"/>
+                <w:sz w:val="18"/>
+              </w:rPr>
+              <w:t>ceiling_fan</w:t>
+            </w:r>
+          </w:p>
+        </w:tc>
+        <w:tc>
+          <w:tcPr>
+            <w:tcW w:type="dxa" w:w="1814"/>
+          </w:tcPr>
+          <w:p>
+            <w:r/>
+            <w:r>
+              <w:rPr>
+                <w:sz w:val="18"/>
+              </w:rPr>
+            </w:r>
+          </w:p>
+        </w:tc>
+      </w:tr>
+      <w:tr>
+        <w:tc>
+          <w:tcPr>
+            <w:tcW w:type="dxa" w:w="1134"/>
+          </w:tcPr>
+          <w:p>
+            <w:r/>
+            <w:r>
+              <w:rPr>
+                <w:b/>
+                <w:sz w:val="20"/>
+              </w:rPr>
+              <w:t>audio94</w:t>
+            </w:r>
+          </w:p>
+        </w:tc>
+        <w:tc>
+          <w:tcPr>
+            <w:tcW w:type="dxa" w:w="3061"/>
+          </w:tcPr>
+          <w:p>
+            <w:r/>
+            <w:r>
+              <w:rPr>
+                <w:sz w:val="18"/>
+              </w:rPr>
+              <w:t>The anniversary glass hops on the sideboard</w:t>
+            </w:r>
+          </w:p>
+        </w:tc>
+        <w:tc>
+          <w:tcPr>
+            <w:tcW w:type="dxa" w:w="4649"/>
+          </w:tcPr>
+          <w:p>
+            <w:r/>
+            <w:r>
+              <w:rPr>
+                <w:sz w:val="18"/>
+              </w:rPr>
+              <w:t>A clear glass ring (like a fingertip on a wine glass).</w:t>
+            </w:r>
+          </w:p>
+        </w:tc>
+        <w:tc>
+          <w:tcPr>
+            <w:tcW w:type="dxa" w:w="1247"/>
+          </w:tcPr>
+          <w:p>
+            <w:r/>
+            <w:r>
+              <w:rPr>
+                <w:sz w:val="18"/>
+              </w:rPr>
+              <w:t>1-2 s</w:t>
+            </w:r>
+          </w:p>
+        </w:tc>
+        <w:tc>
+          <w:tcPr>
+            <w:tcW w:type="dxa" w:w="1134"/>
+            <w:shd w:val="clear" w:color="auto" w:fill="FFF3CC"/>
+          </w:tcPr>
+          <w:p>
+            <w:r/>
+            <w:r>
+              <w:rPr>
+                <w:sz w:val="18"/>
+              </w:rPr>
+              <w:t>NICE</w:t>
+            </w:r>
+          </w:p>
+        </w:tc>
+        <w:tc>
+          <w:tcPr>
+            <w:tcW w:type="dxa" w:w="2041"/>
+          </w:tcPr>
+          <w:p>
+            <w:r/>
+            <w:r>
+              <w:rPr>
+                <w:color w:val="808080"/>
+                <w:sz w:val="18"/>
+              </w:rPr>
+              <w:t>glass_ring</w:t>
+            </w:r>
+          </w:p>
+        </w:tc>
+        <w:tc>
+          <w:tcPr>
+            <w:tcW w:type="dxa" w:w="1814"/>
+          </w:tcPr>
+          <w:p>
+            <w:r/>
+            <w:r>
+              <w:rPr>
+                <w:sz w:val="18"/>
+              </w:rPr>
+            </w:r>
+          </w:p>
+        </w:tc>
+      </w:tr>
+      <w:tr>
+        <w:tc>
+          <w:tcPr>
+            <w:tcW w:type="dxa" w:w="1134"/>
+          </w:tcPr>
+          <w:p>
+            <w:r/>
+            <w:r>
+              <w:rPr>
+                <w:b/>
+                <w:sz w:val="20"/>
+              </w:rPr>
+              <w:t>audio95</w:t>
+            </w:r>
+          </w:p>
+        </w:tc>
+        <w:tc>
+          <w:tcPr>
+            <w:tcW w:type="dxa" w:w="3061"/>
+          </w:tcPr>
+          <w:p>
+            <w:r/>
+            <w:r>
+              <w:rPr>
+                <w:sz w:val="18"/>
+              </w:rPr>
+              <w:t>Luna's doll wiggles</w:t>
+            </w:r>
+          </w:p>
+        </w:tc>
+        <w:tc>
+          <w:tcPr>
+            <w:tcW w:type="dxa" w:w="4649"/>
+          </w:tcPr>
+          <w:p>
+            <w:r/>
+            <w:r>
+              <w:rPr>
+                <w:sz w:val="18"/>
+              </w:rPr>
+              <w:t>A soft thump of a cloth doll.</w:t>
+            </w:r>
+          </w:p>
+        </w:tc>
+        <w:tc>
+          <w:tcPr>
+            <w:tcW w:type="dxa" w:w="1247"/>
+          </w:tcPr>
+          <w:p>
+            <w:r/>
+            <w:r>
+              <w:rPr>
+                <w:sz w:val="18"/>
+              </w:rPr>
+              <w:t>0.5 s</w:t>
+            </w:r>
+          </w:p>
+        </w:tc>
+        <w:tc>
+          <w:tcPr>
+            <w:tcW w:type="dxa" w:w="1134"/>
+            <w:shd w:val="clear" w:color="auto" w:fill="FFF3CC"/>
+          </w:tcPr>
+          <w:p>
+            <w:r/>
+            <w:r>
+              <w:rPr>
+                <w:sz w:val="18"/>
+              </w:rPr>
+              <w:t>NICE</w:t>
+            </w:r>
+          </w:p>
+        </w:tc>
+        <w:tc>
+          <w:tcPr>
+            <w:tcW w:type="dxa" w:w="2041"/>
+          </w:tcPr>
+          <w:p>
+            <w:r/>
+            <w:r>
+              <w:rPr>
+                <w:color w:val="808080"/>
+                <w:sz w:val="18"/>
+              </w:rPr>
+              <w:t>doll_thump</w:t>
+            </w:r>
+          </w:p>
+        </w:tc>
+        <w:tc>
+          <w:tcPr>
+            <w:tcW w:type="dxa" w:w="1814"/>
+          </w:tcPr>
+          <w:p>
+            <w:r/>
+            <w:r>
+              <w:rPr>
+                <w:sz w:val="18"/>
+              </w:rPr>
+            </w:r>
+          </w:p>
+        </w:tc>
+      </w:tr>
+      <w:tr>
+        <w:tc>
+          <w:tcPr>
+            <w:tcW w:type="dxa" w:w="1134"/>
+          </w:tcPr>
+          <w:p>
+            <w:r/>
+            <w:r>
+              <w:rPr>
+                <w:b/>
+                <w:sz w:val="20"/>
+              </w:rPr>
+              <w:t>audio96</w:t>
+            </w:r>
+          </w:p>
+        </w:tc>
+        <w:tc>
+          <w:tcPr>
+            <w:tcW w:type="dxa" w:w="3061"/>
+          </w:tcPr>
+          <w:p>
+            <w:r/>
+            <w:r>
+              <w:rPr>
+                <w:sz w:val="18"/>
+              </w:rPr>
+              <w:t>Luna's rubber duck bounces</w:t>
+            </w:r>
+          </w:p>
+        </w:tc>
+        <w:tc>
+          <w:tcPr>
+            <w:tcW w:type="dxa" w:w="4649"/>
+          </w:tcPr>
+          <w:p>
+            <w:r/>
+            <w:r>
+              <w:rPr>
+                <w:sz w:val="18"/>
+              </w:rPr>
+              <w:t>A rubber duck squeak.</w:t>
+            </w:r>
+          </w:p>
+        </w:tc>
+        <w:tc>
+          <w:tcPr>
+            <w:tcW w:type="dxa" w:w="1247"/>
+          </w:tcPr>
+          <w:p>
+            <w:r/>
+            <w:r>
+              <w:rPr>
+                <w:sz w:val="18"/>
+              </w:rPr>
+              <w:t>0.5 s</w:t>
+            </w:r>
+          </w:p>
+        </w:tc>
+        <w:tc>
+          <w:tcPr>
+            <w:tcW w:type="dxa" w:w="1134"/>
+            <w:shd w:val="clear" w:color="auto" w:fill="FFF3CC"/>
+          </w:tcPr>
+          <w:p>
+            <w:r/>
+            <w:r>
+              <w:rPr>
+                <w:sz w:val="18"/>
+              </w:rPr>
+              <w:t>NICE</w:t>
+            </w:r>
+          </w:p>
+        </w:tc>
+        <w:tc>
+          <w:tcPr>
+            <w:tcW w:type="dxa" w:w="2041"/>
+          </w:tcPr>
+          <w:p>
+            <w:r/>
+            <w:r>
+              <w:rPr>
+                <w:color w:val="808080"/>
+                <w:sz w:val="18"/>
+              </w:rPr>
+              <w:t>duck_squeak</w:t>
+            </w:r>
+          </w:p>
+        </w:tc>
+        <w:tc>
+          <w:tcPr>
+            <w:tcW w:type="dxa" w:w="1814"/>
+          </w:tcPr>
+          <w:p>
+            <w:r/>
+            <w:r>
+              <w:rPr>
+                <w:sz w:val="18"/>
+              </w:rPr>
+            </w:r>
+          </w:p>
+        </w:tc>
+      </w:tr>
+      <w:tr>
+        <w:tc>
+          <w:tcPr>
+            <w:tcW w:type="dxa" w:w="1134"/>
+          </w:tcPr>
+          <w:p>
+            <w:r/>
+            <w:r>
+              <w:rPr>
+                <w:b/>
+                <w:sz w:val="20"/>
+              </w:rPr>
+              <w:t>audio97</w:t>
+            </w:r>
+          </w:p>
+        </w:tc>
+        <w:tc>
+          <w:tcPr>
+            <w:tcW w:type="dxa" w:w="3061"/>
+          </w:tcPr>
+          <w:p>
+            <w:r/>
+            <w:r>
+              <w:rPr>
+                <w:sz w:val="18"/>
+              </w:rPr>
+              <w:t>Luna's toy airplane turns</w:t>
+            </w:r>
+          </w:p>
+        </w:tc>
+        <w:tc>
+          <w:tcPr>
+            <w:tcW w:type="dxa" w:w="4649"/>
+          </w:tcPr>
+          <w:p>
+            <w:r/>
+            <w:r>
+              <w:rPr>
+                <w:sz w:val="18"/>
+              </w:rPr>
+              <w:t>A tiny toy-plane whoosh, playful.</w:t>
+            </w:r>
+          </w:p>
+        </w:tc>
+        <w:tc>
+          <w:tcPr>
+            <w:tcW w:type="dxa" w:w="1247"/>
+          </w:tcPr>
+          <w:p>
+            <w:r/>
+            <w:r>
+              <w:rPr>
+                <w:sz w:val="18"/>
+              </w:rPr>
+              <w:t>1 s</w:t>
+            </w:r>
+          </w:p>
+        </w:tc>
+        <w:tc>
+          <w:tcPr>
+            <w:tcW w:type="dxa" w:w="1134"/>
+            <w:shd w:val="clear" w:color="auto" w:fill="FFF3CC"/>
+          </w:tcPr>
+          <w:p>
+            <w:r/>
+            <w:r>
+              <w:rPr>
+                <w:sz w:val="18"/>
+              </w:rPr>
+              <w:t>NICE</w:t>
+            </w:r>
+          </w:p>
+        </w:tc>
+        <w:tc>
+          <w:tcPr>
+            <w:tcW w:type="dxa" w:w="2041"/>
+          </w:tcPr>
+          <w:p>
+            <w:r/>
+            <w:r>
+              <w:rPr>
+                <w:color w:val="808080"/>
+                <w:sz w:val="18"/>
+              </w:rPr>
+              <w:t>airplane_whoosh</w:t>
+            </w:r>
+          </w:p>
+        </w:tc>
+        <w:tc>
+          <w:tcPr>
+            <w:tcW w:type="dxa" w:w="1814"/>
+          </w:tcPr>
+          <w:p>
+            <w:r/>
+            <w:r>
+              <w:rPr>
+                <w:sz w:val="18"/>
+              </w:rPr>
+            </w:r>
+          </w:p>
+        </w:tc>
+      </w:tr>
+      <w:tr>
+        <w:tc>
+          <w:tcPr>
+            <w:tcW w:type="dxa" w:w="1134"/>
+          </w:tcPr>
+          <w:p>
+            <w:r/>
+            <w:r>
+              <w:rPr>
+                <w:b/>
+                <w:sz w:val="20"/>
+              </w:rPr>
+              <w:t>audio98</w:t>
+            </w:r>
+          </w:p>
+        </w:tc>
+        <w:tc>
+          <w:tcPr>
+            <w:tcW w:type="dxa" w:w="3061"/>
+          </w:tcPr>
+          <w:p>
+            <w:r/>
+            <w:r>
+              <w:rPr>
+                <w:sz w:val="18"/>
+              </w:rPr>
+              <w:t>Luna's piggy bank rattles</w:t>
+            </w:r>
+          </w:p>
+        </w:tc>
+        <w:tc>
+          <w:tcPr>
+            <w:tcW w:type="dxa" w:w="4649"/>
+          </w:tcPr>
+          <w:p>
+            <w:r/>
+            <w:r>
+              <w:rPr>
+                <w:sz w:val="18"/>
+              </w:rPr>
+              <w:t>Coins rattling inside a ceramic piggy bank.</w:t>
+            </w:r>
+          </w:p>
+        </w:tc>
+        <w:tc>
+          <w:tcPr>
+            <w:tcW w:type="dxa" w:w="1247"/>
+          </w:tcPr>
+          <w:p>
+            <w:r/>
+            <w:r>
+              <w:rPr>
+                <w:sz w:val="18"/>
+              </w:rPr>
+              <w:t>1 s</w:t>
+            </w:r>
+          </w:p>
+        </w:tc>
+        <w:tc>
+          <w:tcPr>
+            <w:tcW w:type="dxa" w:w="1134"/>
+            <w:shd w:val="clear" w:color="auto" w:fill="FFF3CC"/>
+          </w:tcPr>
+          <w:p>
+            <w:r/>
+            <w:r>
+              <w:rPr>
+                <w:sz w:val="18"/>
+              </w:rPr>
+              <w:t>NICE</w:t>
+            </w:r>
+          </w:p>
+        </w:tc>
+        <w:tc>
+          <w:tcPr>
+            <w:tcW w:type="dxa" w:w="2041"/>
+          </w:tcPr>
+          <w:p>
+            <w:r/>
+            <w:r>
+              <w:rPr>
+                <w:color w:val="808080"/>
+                <w:sz w:val="18"/>
+              </w:rPr>
+              <w:t>piggy_rattle</w:t>
+            </w:r>
+          </w:p>
+        </w:tc>
+        <w:tc>
+          <w:tcPr>
+            <w:tcW w:type="dxa" w:w="1814"/>
+          </w:tcPr>
+          <w:p>
+            <w:r/>
+            <w:r>
+              <w:rPr>
+                <w:sz w:val="18"/>
+              </w:rPr>
+            </w:r>
+          </w:p>
+        </w:tc>
+      </w:tr>
+      <w:tr>
+        <w:tc>
+          <w:tcPr>
+            <w:tcW w:type="dxa" w:w="1134"/>
+          </w:tcPr>
+          <w:p>
+            <w:r/>
+            <w:r>
+              <w:rPr>
+                <w:b/>
+                <w:sz w:val="20"/>
+              </w:rPr>
+              <w:t>audio99</w:t>
+            </w:r>
+          </w:p>
+        </w:tc>
+        <w:tc>
+          <w:tcPr>
+            <w:tcW w:type="dxa" w:w="3061"/>
+          </w:tcPr>
+          <w:p>
+            <w:r/>
+            <w:r>
+              <w:rPr>
+                <w:sz w:val="18"/>
+              </w:rPr>
+              <w:t>The wrapped present jumps</w:t>
+            </w:r>
+          </w:p>
+        </w:tc>
+        <w:tc>
+          <w:tcPr>
+            <w:tcW w:type="dxa" w:w="4649"/>
+          </w:tcPr>
+          <w:p>
+            <w:r/>
+            <w:r>
+              <w:rPr>
+                <w:sz w:val="18"/>
+              </w:rPr>
+              <w:t>A box with something inside, shaken; paper crinkle.</w:t>
+            </w:r>
+          </w:p>
+        </w:tc>
+        <w:tc>
+          <w:tcPr>
+            <w:tcW w:type="dxa" w:w="1247"/>
+          </w:tcPr>
+          <w:p>
+            <w:r/>
+            <w:r>
+              <w:rPr>
+                <w:sz w:val="18"/>
+              </w:rPr>
+              <w:t>1 s</w:t>
+            </w:r>
+          </w:p>
+        </w:tc>
+        <w:tc>
+          <w:tcPr>
+            <w:tcW w:type="dxa" w:w="1134"/>
+            <w:shd w:val="clear" w:color="auto" w:fill="FFF3CC"/>
+          </w:tcPr>
+          <w:p>
+            <w:r/>
+            <w:r>
+              <w:rPr>
+                <w:sz w:val="18"/>
+              </w:rPr>
+              <w:t>NICE</w:t>
+            </w:r>
+          </w:p>
+        </w:tc>
+        <w:tc>
+          <w:tcPr>
+            <w:tcW w:type="dxa" w:w="2041"/>
+          </w:tcPr>
+          <w:p>
+            <w:r/>
+            <w:r>
+              <w:rPr>
+                <w:color w:val="808080"/>
+                <w:sz w:val="18"/>
+              </w:rPr>
+              <w:t>present_shake</w:t>
+            </w:r>
+          </w:p>
+        </w:tc>
+        <w:tc>
+          <w:tcPr>
+            <w:tcW w:type="dxa" w:w="1814"/>
+          </w:tcPr>
+          <w:p>
+            <w:r/>
+            <w:r>
+              <w:rPr>
+                <w:sz w:val="18"/>
+              </w:rPr>
+            </w:r>
+          </w:p>
+        </w:tc>
+      </w:tr>
+    </w:tbl>
+    <w:p/>
+    <w:p>
+      <w:pPr>
+        <w:pStyle w:val="Heading1"/>
+      </w:pPr>
+      <w:r>
         <w:t>Where the game finds them</w:t>
       </w:r>
     </w:p>
@@ -10211,7 +11574,7 @@
     </w:p>
     <w:p>
       <w:r>
-        <w:t>Total rows in this list: 87.</w:t>
+        <w:t>Total rows in this list: 99.</w:t>
       </w:r>
     </w:p>
     <w:sectPr>

</xml_diff>